<commit_message>
Release corrected DWSIM cross-check package v0.2.1
</commit_message>
<xml_diff>
--- a/manuscript/SPT_PRESSURE_CONSISTENT_MANUSCRIPT.docx
+++ b/manuscript/SPT_PRESSURE_CONSISTENT_MANUSCRIPT.docx
@@ -80,7 +80,7 @@
           <w:color w:val="000000"/>
           <w:sz w:val="21"/>
         </w:rPr>
-        <w:t>Hydrogen pressure swing adsorption must retain product gas for the next purge and repressurization steps before gas can be sold. This work formulates that allocation as a continuous qualified-shipment problem and enforces pressure feasibility between a four-bed PSA, a finite regeneration tank, valves, and a polishing train. A pressure audit showed that the preliminary 7.0 bar tank could not be passively refilled from a 6.2 bar product manifold. The corrected topology therefore uses a 6.0 bar regulated tank, a 0.2 bar fill driving margin, and a discharge booster to the 6.5 bar regeneration header. Within declared feed, adsorption-equilibrium, and kinetic uncertainty, the selected policy of 4 s active purge and 540 s adsorption passed all eight corner cases and all eight predeclared interior hold-outs; a 6 s, 480 s comparison passed none. Specification-qualified hydrogen shipment increased by 6.785-7.341%, the minimum reserve-margin gain was 0.542 bar, and conservative booster duty remained below 0.198 kWh kg-1 H2. A literature-parameterized polymer concentrator followed by dense palladium polishing passed all 16 direct cases. Adaptive DOP853 integration corrected a near-boundary 20%-permeance-loss guard from 0.553 to 0.554 m2; the revised design gave at least 88.322% recovery and maximum CO, CO2, N2, and CH4 contents of 0.121, 4.000, 48.83, and 25.07 ppm. A public actual-syngas 50%-permeance-retention stress increased the conditional installed area to 0.887 m2 and retained all 16 cases. A separately coded fixed-area RK4 solver reproduced all 32 design-case labels, with a maximum recovery difference below 9.4e-8 percentage point relative to DOP853. For a 0.440 m2 chance design, error-buffered trilinear integration gave a minimum scrambled-Sobol probability of 0.956673; a conservative affine event gave 0.951210, and its 10-bit discretization gave 0.950629 with no direct label errors. An exact portable OpenQASM 3 oracle uses 66 logical qubits, 24,042 CX gates, 61,269 primitive gates, and all-to-all depth 36,163 before optimization or routing. Exhaustive 2-, 3-, and 4-bit checks plus direct and random 10-bit checks gave zero phase-label and work-qubit-restoration errors. Device-specific optimization and a corrected-input DWSIM run remain external execution steps. For this smooth three-variable event, randomized quasi-Monte Carlo remains the practical estimator. The contribution is a pressure-consistent separation design rule and an auditable process-to-oracle construction for future higher-dimensional plant uncertainty.</w:t>
+        <w:t>Hydrogen pressure swing adsorption must retain product gas for the next purge and repressurization steps before gas can be sold. This work formulates that allocation as a continuous qualified-shipment problem and enforces pressure feasibility between a four-bed PSA, a finite regeneration tank, valves, and a polishing train. A pressure audit showed that the preliminary 7.0 bar tank could not be passively refilled from a 6.2 bar product manifold. The corrected topology therefore uses a 6.0 bar regulated tank, a 0.2 bar fill driving margin, and a discharge booster to the 6.5 bar regeneration header. Within declared feed, adsorption-equilibrium, and kinetic uncertainty, the selected policy of 4 s active purge and 540 s adsorption passed all eight corner cases and all eight predeclared interior hold-outs; a 6 s, 480 s comparison passed none. Specification-qualified hydrogen shipment increased by 6.785-7.341%, the minimum reserve-margin gain was 0.542 bar, and conservative booster duty remained below 0.198 kWh kg-1 H2. A literature-parameterized polymer concentrator followed by dense palladium polishing passed all 16 direct cases. Adaptive DOP853 integration corrected a near-boundary 20%-permeance-loss guard from 0.553 to 0.554 m2; the revised design gave at least 88.322% recovery and maximum CO, CO2, N2, and CH4 contents of 0.121, 4.000, 48.83, and 25.07 ppm. A public actual-syngas 50%-permeance-retention stress increased the conditional installed area to 0.887 m2 and retained all 16 cases. A separately coded fixed-area RK4 solver reproduced all 32 design-case labels, with a maximum recovery difference below 9.4e-8 percentage point relative to DOP853. A corrected DWSIM 8.7.1 Peng-Robinson calculation solved all 16 horizon-averaged cases at the 6.2 bar inlet, with maximum component-balance error 8.95e-19 mol s-1 and compression demand of 3.091-3.183 kWh kg-1 H2. For a 0.440 m2 chance design, error-buffered trilinear integration gave a minimum scrambled-Sobol probability of 0.956673; a conservative affine event gave 0.951210, and its 10-bit discretization gave 0.950629 with no direct label errors. An exact portable OpenQASM 3 oracle uses 66 logical qubits, 24,042 CX gates, 61,269 primitive gates, and all-to-all depth 36,163 before optimization or routing. Exhaustive 2-, 3-, and 4-bit checks plus direct and random 10-bit checks gave zero phase-label and work-qubit-restoration errors. For this smooth three-variable event, randomized quasi-Monte Carlo remains the practical estimator. The contribution is a pressure-consistent separation design rule and an auditable process-to-oracle construction for future higher-dimensional plant uncertainty.</w:t>
       </w:r>
     </w:p>
     <w:p>
@@ -219,6 +219,20 @@
           <w:color w:val="000000"/>
           <w:sz w:val="21"/>
         </w:rPr>
+        <w:t>Corrected DWSIM Peng-Robinson calculations solve all 16 process cases</w:t>
+      </w:r>
+    </w:p>
+    <w:p>
+      <w:pPr>
+        <w:pStyle w:val="ListBullet"/>
+        <w:spacing w:after="40"/>
+      </w:pPr>
+      <w:r>
+        <w:rPr>
+          <w:rFonts w:ascii="Times New Roman" w:hAnsi="Times New Roman"/>
+          <w:color w:val="000000"/>
+          <w:sz w:val="21"/>
+        </w:rPr>
         <w:t>A verified 66-qubit OpenQASM oracle connects the process chance constraint to QAE</w:t>
       </w:r>
     </w:p>
@@ -543,7 +557,7 @@
           <w:color w:val="000000"/>
           <w:sz w:val="21"/>
         </w:rPr>
-        <w:t>Compression is recalculated from the corrected 6.2 bar product manifold to the 20 bar polishing buffer and from the 1 bar polymer permeate to the 20 bar palladium feed. A corrected 16-case DWSIM input deck was generated, but local execution stopped when Windows Application Control blocked DWSIM.FileStorage.dll. Earlier Peng-Robinson runs are therefore shown only as evidence that the flowsheet and staged-compression method execute; their numerical duties are not used as current corrected-input results.</w:t>
+        <w:t>Compression is recalculated from the corrected 6.2 bar product manifold to the 20 bar polishing buffer and from the 1 bar polymer permeate to the 20 bar palladium feed. The corrected 16-case deck was executed in DWSIM 8.7.1 with the Peng-Robinson property package, a 72% efficient first compressor, and three equal-pressure-ratio intercooled recompression stages. Windows Application Control blocked the distributed file-storage assembly only; a syntax-equivalent local rebuild from the official v8.7.1 source was preloaded, while the thermodynamic and unit-operation assemblies remained unchanged. DWSIM receives horizon-averaged component split fractions from the packet-resolved Python membrane model, so this is an independent pressure, duty, thermodynamic-state, and material-closure check rather than an independent membrane-transport calculation.</w:t>
       </w:r>
     </w:p>
     <w:p>
@@ -612,7 +626,7 @@
           <w:color w:val="000000"/>
           <w:sz w:val="21"/>
         </w:rPr>
-        <w:t>Earlier DWSIM hot-stage calculations established a workable Peng-Robinson flowsheet with three-stage recompression, a 420 C palladium heater, coolers, and component closure. Because the pressure-consistent input rerun is blocked on the current host, those values are retained as a structural and method cross-check only. Published 22-26 bar palladium inhibition and endurance studies [23,24] independently define the pressure and temperature evidence boundary.</w:t>
+        <w:t>The corrected DWSIM calculation establishes the 6.2-to-20 bar compression, three-stage recompression, intercooling, and component closure at 298.15 K. An earlier hot-stage calculation additionally documents a 420 C palladium heater and coolers for the preceding input set; its heat-integration numbers are retained only as structural evidence. Published 22-26 bar palladium inhibition and endurance studies [23,24] independently define the high-temperature evidence boundary.</w:t>
       </w:r>
     </w:p>
     <w:p>
@@ -2882,7 +2896,7 @@
                 <w:color w:val="000000"/>
                 <w:sz w:val="16"/>
               </w:rPr>
-              <w:t>input deck frozen</w:t>
+              <w:t>16/16 solved</w:t>
             </w:r>
           </w:p>
         </w:tc>
@@ -2910,7 +2924,7 @@
                 <w:color w:val="000000"/>
                 <w:sz w:val="16"/>
               </w:rPr>
-              <w:t>Execution pending</w:t>
+              <w:t>Pressure/duty/closure</w:t>
             </w:r>
           </w:p>
         </w:tc>
@@ -2929,7 +2943,7 @@
           <w:p>
             <w:pPr>
               <w:spacing w:after="0" w:line="240" w:lineRule="auto"/>
-              <w:jc w:val="center"/>
+              <w:jc w:val="left"/>
             </w:pPr>
             <w:r>
               <w:rPr>
@@ -2938,7 +2952,7 @@
                 <w:color w:val="000000"/>
                 <w:sz w:val="16"/>
               </w:rPr>
-              <w:t>Host DLL blocked</w:t>
+              <w:t>Supplied membrane splits</w:t>
             </w:r>
           </w:p>
         </w:tc>
@@ -4262,7 +4276,7 @@
         <w:keepNext/>
       </w:pPr>
       <w:r>
-        <w:t>4.6 Corrected compression duty and external-simulator boundary</w:t>
+        <w:t>4.6 Corrected DWSIM compression and process-simulator cross-check</w:t>
       </w:r>
     </w:p>
     <w:p>
@@ -4277,7 +4291,7 @@
           <w:color w:val="000000"/>
           <w:sz w:val="21"/>
         </w:rPr>
-        <w:t>Changing the polishing inlet from the obsolete 8 bar assumption to the physically available 6.2 bar manifold increased the conservative design-screen compression requirement to 2.573 kWh kg-1 H2, without changing area, recovery, purity, or pass labels. A corrected 16-case DWSIM deck was generated. Its execution was blocked before solving by Windows Application Control, so earlier DWSIM results in Figure 8 are not used as corrected quantitative evidence.</w:t>
+        <w:t>Changing the polishing inlet from the obsolete 8 bar assumption to the physically available 6.2 bar manifold increased the ideal-gas isothermal design-screen requirement to 2.573 kWh kg-1 H2, without changing area, recovery, purity, or pass labels. The corrected DWSIM deck solved all 16 cases with zero calculation errors. Maximum component-balance error was 8.95e-19 mol s-1 and maximum product-stream difference from the supplied split fractions was 1.30e-18 mol s-1. DWSIM adiabatic compression required 3.091-3.183 kWh kg-1 H2, 16.94-16.98% above the matched isothermal lower bound. Maximum first-compressor and recompression-stage discharge temperatures were 460.03 and 433.64 K, respectively.</w:t>
       </w:r>
     </w:p>
     <w:p>
@@ -4298,7 +4312,7 @@
               <a:graphicData uri="http://schemas.openxmlformats.org/drawingml/2006/picture">
                 <pic:pic>
                   <pic:nvPicPr>
-                    <pic:cNvPr id="0" name="Fig8_psa_stage_train_dwsim_crosscheck.png"/>
+                    <pic:cNvPr id="0" name="Fig_psa_stage_train_dwsim_crosscheck.png"/>
                     <pic:cNvPicPr/>
                   </pic:nvPicPr>
                   <pic:blipFill>
@@ -4341,7 +4355,7 @@
           <w:color w:val="000000"/>
           <w:sz w:val="18"/>
         </w:rPr>
-        <w:t>Earlier DWSIM Peng-Robinson structural cross-check. The flowsheet method is retained, while its numerical duties are not used as corrected 6.2 bar inlet results.</w:t>
+        <w:t>Corrected DWSIM 8.7.1 Peng-Robinson cross-check for all 16 horizon-averaged cases at the 6.2 bar polishing inlet. The calculation independently checks pressure states, compression and cooling duties, temperatures, and material closure while using membrane split fractions supplied by the packet model.</w:t>
       </w:r>
     </w:p>
     <w:p>
@@ -4762,7 +4776,7 @@
                 <w:color w:val="000000"/>
                 <w:sz w:val="16"/>
               </w:rPr>
-              <w:t>QAE event</w:t>
+              <w:t>DWSIM compression</w:t>
             </w:r>
           </w:p>
         </w:tc>
@@ -4790,7 +4804,148 @@
                 <w:color w:val="000000"/>
                 <w:sz w:val="16"/>
               </w:rPr>
-              <w:t>Chance Pd area</w:t>
+              <w:t>Adiabatic range</w:t>
+            </w:r>
+          </w:p>
+        </w:tc>
+        <w:tc>
+          <w:tcPr>
+            <w:tcW w:type="dxa" w:w="3331"/>
+            <w:shd w:fill="EAF2F8"/>
+            <w:vAlign w:val="center"/>
+            <w:tcMar>
+              <w:top w:w="80" w:type="dxa"/>
+              <w:start w:w="80" w:type="dxa"/>
+              <w:bottom w:w="80" w:type="dxa"/>
+              <w:end w:w="80" w:type="dxa"/>
+            </w:tcMar>
+          </w:tcPr>
+          <w:p>
+            <w:pPr>
+              <w:spacing w:after="0" w:line="240" w:lineRule="auto"/>
+              <w:jc w:val="left"/>
+            </w:pPr>
+            <w:r>
+              <w:rPr>
+                <w:rFonts w:ascii="Times New Roman" w:hAnsi="Times New Roman"/>
+                <w:b w:val="0"/>
+                <w:color w:val="000000"/>
+                <w:sz w:val="16"/>
+              </w:rPr>
+              <w:t>3.091-3.183 kWh kg-1 H2</w:t>
+            </w:r>
+          </w:p>
+        </w:tc>
+      </w:tr>
+      <w:tr>
+        <w:tc>
+          <w:tcPr>
+            <w:tcW w:type="dxa" w:w="3331"/>
+            <w:vAlign w:val="center"/>
+            <w:tcMar>
+              <w:top w:w="80" w:type="dxa"/>
+              <w:start w:w="80" w:type="dxa"/>
+              <w:bottom w:w="80" w:type="dxa"/>
+              <w:end w:w="80" w:type="dxa"/>
+            </w:tcMar>
+          </w:tcPr>
+          <w:p>
+            <w:pPr>
+              <w:spacing w:after="0" w:line="240" w:lineRule="auto"/>
+              <w:jc w:val="left"/>
+            </w:pPr>
+            <w:r>
+              <w:rPr>
+                <w:rFonts w:ascii="Times New Roman" w:hAnsi="Times New Roman"/>
+                <w:b w:val="0"/>
+                <w:color w:val="000000"/>
+                <w:sz w:val="16"/>
+              </w:rPr>
+              <w:t>DWSIM compression</w:t>
+            </w:r>
+          </w:p>
+        </w:tc>
+        <w:tc>
+          <w:tcPr>
+            <w:tcW w:type="dxa" w:w="3331"/>
+            <w:vAlign w:val="center"/>
+            <w:tcMar>
+              <w:top w:w="80" w:type="dxa"/>
+              <w:start w:w="80" w:type="dxa"/>
+              <w:bottom w:w="80" w:type="dxa"/>
+              <w:end w:w="80" w:type="dxa"/>
+            </w:tcMar>
+          </w:tcPr>
+          <w:p>
+            <w:pPr>
+              <w:spacing w:after="0" w:line="240" w:lineRule="auto"/>
+              <w:jc w:val="left"/>
+            </w:pPr>
+            <w:r>
+              <w:rPr>
+                <w:rFonts w:ascii="Times New Roman" w:hAnsi="Times New Roman"/>
+                <w:b w:val="0"/>
+                <w:color w:val="000000"/>
+                <w:sz w:val="16"/>
+              </w:rPr>
+              <w:t>Premium over isothermal</w:t>
+            </w:r>
+          </w:p>
+        </w:tc>
+        <w:tc>
+          <w:tcPr>
+            <w:tcW w:type="dxa" w:w="3331"/>
+            <w:vAlign w:val="center"/>
+            <w:tcMar>
+              <w:top w:w="80" w:type="dxa"/>
+              <w:start w:w="80" w:type="dxa"/>
+              <w:bottom w:w="80" w:type="dxa"/>
+              <w:end w:w="80" w:type="dxa"/>
+            </w:tcMar>
+          </w:tcPr>
+          <w:p>
+            <w:pPr>
+              <w:spacing w:after="0" w:line="240" w:lineRule="auto"/>
+              <w:jc w:val="center"/>
+            </w:pPr>
+            <w:r>
+              <w:rPr>
+                <w:rFonts w:ascii="Times New Roman" w:hAnsi="Times New Roman"/>
+                <w:b w:val="0"/>
+                <w:color w:val="000000"/>
+                <w:sz w:val="16"/>
+              </w:rPr>
+              <w:t>16.94-16.98%</w:t>
+            </w:r>
+          </w:p>
+        </w:tc>
+      </w:tr>
+      <w:tr>
+        <w:tc>
+          <w:tcPr>
+            <w:tcW w:type="dxa" w:w="3331"/>
+            <w:shd w:fill="EAF2F8"/>
+            <w:vAlign w:val="center"/>
+            <w:tcMar>
+              <w:top w:w="80" w:type="dxa"/>
+              <w:start w:w="80" w:type="dxa"/>
+              <w:bottom w:w="80" w:type="dxa"/>
+              <w:end w:w="80" w:type="dxa"/>
+            </w:tcMar>
+          </w:tcPr>
+          <w:p>
+            <w:pPr>
+              <w:spacing w:after="0" w:line="240" w:lineRule="auto"/>
+              <w:jc w:val="left"/>
+            </w:pPr>
+            <w:r>
+              <w:rPr>
+                <w:rFonts w:ascii="Times New Roman" w:hAnsi="Times New Roman"/>
+                <w:b w:val="0"/>
+                <w:color w:val="000000"/>
+                <w:sz w:val="16"/>
+              </w:rPr>
+              <w:t>DWSIM temperatures</w:t>
             </w:r>
           </w:p>
         </w:tc>
@@ -4818,7 +4973,35 @@
                 <w:color w:val="000000"/>
                 <w:sz w:val="16"/>
               </w:rPr>
-              <w:t>0.440 m2</w:t>
+              <w:t>Maximum discharges</w:t>
+            </w:r>
+          </w:p>
+        </w:tc>
+        <w:tc>
+          <w:tcPr>
+            <w:tcW w:type="dxa" w:w="3331"/>
+            <w:shd w:fill="EAF2F8"/>
+            <w:vAlign w:val="center"/>
+            <w:tcMar>
+              <w:top w:w="80" w:type="dxa"/>
+              <w:start w:w="80" w:type="dxa"/>
+              <w:bottom w:w="80" w:type="dxa"/>
+              <w:end w:w="80" w:type="dxa"/>
+            </w:tcMar>
+          </w:tcPr>
+          <w:p>
+            <w:pPr>
+              <w:spacing w:after="0" w:line="240" w:lineRule="auto"/>
+              <w:jc w:val="center"/>
+            </w:pPr>
+            <w:r>
+              <w:rPr>
+                <w:rFonts w:ascii="Times New Roman" w:hAnsi="Times New Roman"/>
+                <w:b w:val="0"/>
+                <w:color w:val="000000"/>
+                <w:sz w:val="16"/>
+              </w:rPr>
+              <w:t>460.03 / 433.64 K</w:t>
             </w:r>
           </w:p>
         </w:tc>
@@ -4865,7 +5048,7 @@
           <w:p>
             <w:pPr>
               <w:spacing w:after="0" w:line="240" w:lineRule="auto"/>
-              <w:jc w:val="left"/>
+              <w:jc w:val="center"/>
             </w:pPr>
             <w:r>
               <w:rPr>
@@ -4874,7 +5057,7 @@
                 <w:color w:val="000000"/>
                 <w:sz w:val="16"/>
               </w:rPr>
-              <w:t>Continuous affine probability</w:t>
+              <w:t>Chance Pd area</w:t>
             </w:r>
           </w:p>
         </w:tc>
@@ -4901,7 +5084,176 @@
                 <w:color w:val="000000"/>
                 <w:sz w:val="16"/>
               </w:rPr>
+              <w:t>0.440 m2</w:t>
+            </w:r>
+          </w:p>
+        </w:tc>
+      </w:tr>
+      <w:tr>
+        <w:tc>
+          <w:tcPr>
+            <w:tcW w:type="dxa" w:w="3331"/>
+            <w:shd w:fill="EAF2F8"/>
+            <w:vAlign w:val="center"/>
+            <w:tcMar>
+              <w:top w:w="80" w:type="dxa"/>
+              <w:start w:w="80" w:type="dxa"/>
+              <w:bottom w:w="80" w:type="dxa"/>
+              <w:end w:w="80" w:type="dxa"/>
+            </w:tcMar>
+          </w:tcPr>
+          <w:p>
+            <w:pPr>
+              <w:spacing w:after="0" w:line="240" w:lineRule="auto"/>
+              <w:jc w:val="left"/>
+            </w:pPr>
+            <w:r>
+              <w:rPr>
+                <w:rFonts w:ascii="Times New Roman" w:hAnsi="Times New Roman"/>
+                <w:b w:val="0"/>
+                <w:color w:val="000000"/>
+                <w:sz w:val="16"/>
+              </w:rPr>
+              <w:t>QAE event</w:t>
+            </w:r>
+          </w:p>
+        </w:tc>
+        <w:tc>
+          <w:tcPr>
+            <w:tcW w:type="dxa" w:w="3331"/>
+            <w:shd w:fill="EAF2F8"/>
+            <w:vAlign w:val="center"/>
+            <w:tcMar>
+              <w:top w:w="80" w:type="dxa"/>
+              <w:start w:w="80" w:type="dxa"/>
+              <w:bottom w:w="80" w:type="dxa"/>
+              <w:end w:w="80" w:type="dxa"/>
+            </w:tcMar>
+          </w:tcPr>
+          <w:p>
+            <w:pPr>
+              <w:spacing w:after="0" w:line="240" w:lineRule="auto"/>
+              <w:jc w:val="left"/>
+            </w:pPr>
+            <w:r>
+              <w:rPr>
+                <w:rFonts w:ascii="Times New Roman" w:hAnsi="Times New Roman"/>
+                <w:b w:val="0"/>
+                <w:color w:val="000000"/>
+                <w:sz w:val="16"/>
+              </w:rPr>
+              <w:t>Continuous affine probability</w:t>
+            </w:r>
+          </w:p>
+        </w:tc>
+        <w:tc>
+          <w:tcPr>
+            <w:tcW w:type="dxa" w:w="3331"/>
+            <w:shd w:fill="EAF2F8"/>
+            <w:vAlign w:val="center"/>
+            <w:tcMar>
+              <w:top w:w="80" w:type="dxa"/>
+              <w:start w:w="80" w:type="dxa"/>
+              <w:bottom w:w="80" w:type="dxa"/>
+              <w:end w:w="80" w:type="dxa"/>
+            </w:tcMar>
+          </w:tcPr>
+          <w:p>
+            <w:pPr>
+              <w:spacing w:after="0" w:line="240" w:lineRule="auto"/>
+              <w:jc w:val="center"/>
+            </w:pPr>
+            <w:r>
+              <w:rPr>
+                <w:rFonts w:ascii="Times New Roman" w:hAnsi="Times New Roman"/>
+                <w:b w:val="0"/>
+                <w:color w:val="000000"/>
+                <w:sz w:val="16"/>
+              </w:rPr>
               <w:t>0.951210</w:t>
+            </w:r>
+          </w:p>
+        </w:tc>
+      </w:tr>
+      <w:tr>
+        <w:tc>
+          <w:tcPr>
+            <w:tcW w:type="dxa" w:w="3331"/>
+            <w:vAlign w:val="center"/>
+            <w:tcMar>
+              <w:top w:w="80" w:type="dxa"/>
+              <w:start w:w="80" w:type="dxa"/>
+              <w:bottom w:w="80" w:type="dxa"/>
+              <w:end w:w="80" w:type="dxa"/>
+            </w:tcMar>
+          </w:tcPr>
+          <w:p>
+            <w:pPr>
+              <w:spacing w:after="0" w:line="240" w:lineRule="auto"/>
+              <w:jc w:val="left"/>
+            </w:pPr>
+            <w:r>
+              <w:rPr>
+                <w:rFonts w:ascii="Times New Roman" w:hAnsi="Times New Roman"/>
+                <w:b w:val="0"/>
+                <w:color w:val="000000"/>
+                <w:sz w:val="16"/>
+              </w:rPr>
+              <w:t>QAE event</w:t>
+            </w:r>
+          </w:p>
+        </w:tc>
+        <w:tc>
+          <w:tcPr>
+            <w:tcW w:type="dxa" w:w="3331"/>
+            <w:vAlign w:val="center"/>
+            <w:tcMar>
+              <w:top w:w="80" w:type="dxa"/>
+              <w:start w:w="80" w:type="dxa"/>
+              <w:bottom w:w="80" w:type="dxa"/>
+              <w:end w:w="80" w:type="dxa"/>
+            </w:tcMar>
+          </w:tcPr>
+          <w:p>
+            <w:pPr>
+              <w:spacing w:after="0" w:line="240" w:lineRule="auto"/>
+              <w:jc w:val="center"/>
+            </w:pPr>
+            <w:r>
+              <w:rPr>
+                <w:rFonts w:ascii="Times New Roman" w:hAnsi="Times New Roman"/>
+                <w:b w:val="0"/>
+                <w:color w:val="000000"/>
+                <w:sz w:val="16"/>
+              </w:rPr>
+              <w:t>10-bit probability</w:t>
+            </w:r>
+          </w:p>
+        </w:tc>
+        <w:tc>
+          <w:tcPr>
+            <w:tcW w:type="dxa" w:w="3331"/>
+            <w:vAlign w:val="center"/>
+            <w:tcMar>
+              <w:top w:w="80" w:type="dxa"/>
+              <w:start w:w="80" w:type="dxa"/>
+              <w:bottom w:w="80" w:type="dxa"/>
+              <w:end w:w="80" w:type="dxa"/>
+            </w:tcMar>
+          </w:tcPr>
+          <w:p>
+            <w:pPr>
+              <w:spacing w:after="0" w:line="240" w:lineRule="auto"/>
+              <w:jc w:val="center"/>
+            </w:pPr>
+            <w:r>
+              <w:rPr>
+                <w:rFonts w:ascii="Times New Roman" w:hAnsi="Times New Roman"/>
+                <w:b w:val="0"/>
+                <w:color w:val="000000"/>
+                <w:sz w:val="16"/>
+              </w:rPr>
+              <w:t>0.950629</w:t>
             </w:r>
           </w:p>
         </w:tc>
@@ -4959,7 +5311,7 @@
                 <w:color w:val="000000"/>
                 <w:sz w:val="16"/>
               </w:rPr>
-              <w:t>10-bit probability</w:t>
+              <w:t>Discretization error</w:t>
             </w:r>
           </w:p>
         </w:tc>
@@ -4987,7 +5339,7 @@
                 <w:color w:val="000000"/>
                 <w:sz w:val="16"/>
               </w:rPr>
-              <w:t>0.950629</w:t>
+              <w:t>0.000581</w:t>
             </w:r>
           </w:p>
         </w:tc>
@@ -5043,7 +5395,7 @@
                 <w:color w:val="000000"/>
                 <w:sz w:val="16"/>
               </w:rPr>
-              <w:t>Discretization error</w:t>
+              <w:t>Logical qubits</w:t>
             </w:r>
           </w:p>
         </w:tc>
@@ -5070,176 +5422,7 @@
                 <w:color w:val="000000"/>
                 <w:sz w:val="16"/>
               </w:rPr>
-              <w:t>0.000581</w:t>
-            </w:r>
-          </w:p>
-        </w:tc>
-      </w:tr>
-      <w:tr>
-        <w:tc>
-          <w:tcPr>
-            <w:tcW w:type="dxa" w:w="3331"/>
-            <w:shd w:fill="EAF2F8"/>
-            <w:vAlign w:val="center"/>
-            <w:tcMar>
-              <w:top w:w="80" w:type="dxa"/>
-              <w:start w:w="80" w:type="dxa"/>
-              <w:bottom w:w="80" w:type="dxa"/>
-              <w:end w:w="80" w:type="dxa"/>
-            </w:tcMar>
-          </w:tcPr>
-          <w:p>
-            <w:pPr>
-              <w:spacing w:after="0" w:line="240" w:lineRule="auto"/>
-              <w:jc w:val="left"/>
-            </w:pPr>
-            <w:r>
-              <w:rPr>
-                <w:rFonts w:ascii="Times New Roman" w:hAnsi="Times New Roman"/>
-                <w:b w:val="0"/>
-                <w:color w:val="000000"/>
-                <w:sz w:val="16"/>
-              </w:rPr>
-              <w:t>QAE event</w:t>
-            </w:r>
-          </w:p>
-        </w:tc>
-        <w:tc>
-          <w:tcPr>
-            <w:tcW w:type="dxa" w:w="3331"/>
-            <w:shd w:fill="EAF2F8"/>
-            <w:vAlign w:val="center"/>
-            <w:tcMar>
-              <w:top w:w="80" w:type="dxa"/>
-              <w:start w:w="80" w:type="dxa"/>
-              <w:bottom w:w="80" w:type="dxa"/>
-              <w:end w:w="80" w:type="dxa"/>
-            </w:tcMar>
-          </w:tcPr>
-          <w:p>
-            <w:pPr>
-              <w:spacing w:after="0" w:line="240" w:lineRule="auto"/>
-              <w:jc w:val="center"/>
-            </w:pPr>
-            <w:r>
-              <w:rPr>
-                <w:rFonts w:ascii="Times New Roman" w:hAnsi="Times New Roman"/>
-                <w:b w:val="0"/>
-                <w:color w:val="000000"/>
-                <w:sz w:val="16"/>
-              </w:rPr>
-              <w:t>Logical qubits</w:t>
-            </w:r>
-          </w:p>
-        </w:tc>
-        <w:tc>
-          <w:tcPr>
-            <w:tcW w:type="dxa" w:w="3331"/>
-            <w:shd w:fill="EAF2F8"/>
-            <w:vAlign w:val="center"/>
-            <w:tcMar>
-              <w:top w:w="80" w:type="dxa"/>
-              <w:start w:w="80" w:type="dxa"/>
-              <w:bottom w:w="80" w:type="dxa"/>
-              <w:end w:w="80" w:type="dxa"/>
-            </w:tcMar>
-          </w:tcPr>
-          <w:p>
-            <w:pPr>
-              <w:spacing w:after="0" w:line="240" w:lineRule="auto"/>
-              <w:jc w:val="center"/>
-            </w:pPr>
-            <w:r>
-              <w:rPr>
-                <w:rFonts w:ascii="Times New Roman" w:hAnsi="Times New Roman"/>
-                <w:b w:val="0"/>
-                <w:color w:val="000000"/>
-                <w:sz w:val="16"/>
-              </w:rPr>
               <w:t>66</w:t>
-            </w:r>
-          </w:p>
-        </w:tc>
-      </w:tr>
-      <w:tr>
-        <w:tc>
-          <w:tcPr>
-            <w:tcW w:type="dxa" w:w="3331"/>
-            <w:vAlign w:val="center"/>
-            <w:tcMar>
-              <w:top w:w="80" w:type="dxa"/>
-              <w:start w:w="80" w:type="dxa"/>
-              <w:bottom w:w="80" w:type="dxa"/>
-              <w:end w:w="80" w:type="dxa"/>
-            </w:tcMar>
-          </w:tcPr>
-          <w:p>
-            <w:pPr>
-              <w:spacing w:after="0" w:line="240" w:lineRule="auto"/>
-              <w:jc w:val="left"/>
-            </w:pPr>
-            <w:r>
-              <w:rPr>
-                <w:rFonts w:ascii="Times New Roman" w:hAnsi="Times New Roman"/>
-                <w:b w:val="0"/>
-                <w:color w:val="000000"/>
-                <w:sz w:val="16"/>
-              </w:rPr>
-              <w:t>OpenQASM 3</w:t>
-            </w:r>
-          </w:p>
-        </w:tc>
-        <w:tc>
-          <w:tcPr>
-            <w:tcW w:type="dxa" w:w="3331"/>
-            <w:vAlign w:val="center"/>
-            <w:tcMar>
-              <w:top w:w="80" w:type="dxa"/>
-              <w:start w:w="80" w:type="dxa"/>
-              <w:bottom w:w="80" w:type="dxa"/>
-              <w:end w:w="80" w:type="dxa"/>
-            </w:tcMar>
-          </w:tcPr>
-          <w:p>
-            <w:pPr>
-              <w:spacing w:after="0" w:line="240" w:lineRule="auto"/>
-              <w:jc w:val="center"/>
-            </w:pPr>
-            <w:r>
-              <w:rPr>
-                <w:rFonts w:ascii="Times New Roman" w:hAnsi="Times New Roman"/>
-                <w:b w:val="0"/>
-                <w:color w:val="000000"/>
-                <w:sz w:val="16"/>
-              </w:rPr>
-              <w:t>Portable CX</w:t>
-            </w:r>
-          </w:p>
-        </w:tc>
-        <w:tc>
-          <w:tcPr>
-            <w:tcW w:type="dxa" w:w="3331"/>
-            <w:vAlign w:val="center"/>
-            <w:tcMar>
-              <w:top w:w="80" w:type="dxa"/>
-              <w:start w:w="80" w:type="dxa"/>
-              <w:bottom w:w="80" w:type="dxa"/>
-              <w:end w:w="80" w:type="dxa"/>
-            </w:tcMar>
-          </w:tcPr>
-          <w:p>
-            <w:pPr>
-              <w:spacing w:after="0" w:line="240" w:lineRule="auto"/>
-              <w:jc w:val="center"/>
-            </w:pPr>
-            <w:r>
-              <w:rPr>
-                <w:rFonts w:ascii="Times New Roman" w:hAnsi="Times New Roman"/>
-                <w:b w:val="0"/>
-                <w:color w:val="000000"/>
-                <w:sz w:val="16"/>
-              </w:rPr>
-              <w:t>24,042</w:t>
             </w:r>
           </w:p>
         </w:tc>
@@ -5288,6 +5471,90 @@
           <w:p>
             <w:pPr>
               <w:spacing w:after="0" w:line="240" w:lineRule="auto"/>
+              <w:jc w:val="center"/>
+            </w:pPr>
+            <w:r>
+              <w:rPr>
+                <w:rFonts w:ascii="Times New Roman" w:hAnsi="Times New Roman"/>
+                <w:b w:val="0"/>
+                <w:color w:val="000000"/>
+                <w:sz w:val="16"/>
+              </w:rPr>
+              <w:t>Portable CX</w:t>
+            </w:r>
+          </w:p>
+        </w:tc>
+        <w:tc>
+          <w:tcPr>
+            <w:tcW w:type="dxa" w:w="3331"/>
+            <w:shd w:fill="EAF2F8"/>
+            <w:vAlign w:val="center"/>
+            <w:tcMar>
+              <w:top w:w="80" w:type="dxa"/>
+              <w:start w:w="80" w:type="dxa"/>
+              <w:bottom w:w="80" w:type="dxa"/>
+              <w:end w:w="80" w:type="dxa"/>
+            </w:tcMar>
+          </w:tcPr>
+          <w:p>
+            <w:pPr>
+              <w:spacing w:after="0" w:line="240" w:lineRule="auto"/>
+              <w:jc w:val="center"/>
+            </w:pPr>
+            <w:r>
+              <w:rPr>
+                <w:rFonts w:ascii="Times New Roman" w:hAnsi="Times New Roman"/>
+                <w:b w:val="0"/>
+                <w:color w:val="000000"/>
+                <w:sz w:val="16"/>
+              </w:rPr>
+              <w:t>24,042</w:t>
+            </w:r>
+          </w:p>
+        </w:tc>
+      </w:tr>
+      <w:tr>
+        <w:tc>
+          <w:tcPr>
+            <w:tcW w:type="dxa" w:w="3331"/>
+            <w:vAlign w:val="center"/>
+            <w:tcMar>
+              <w:top w:w="80" w:type="dxa"/>
+              <w:start w:w="80" w:type="dxa"/>
+              <w:bottom w:w="80" w:type="dxa"/>
+              <w:end w:w="80" w:type="dxa"/>
+            </w:tcMar>
+          </w:tcPr>
+          <w:p>
+            <w:pPr>
+              <w:spacing w:after="0" w:line="240" w:lineRule="auto"/>
+              <w:jc w:val="left"/>
+            </w:pPr>
+            <w:r>
+              <w:rPr>
+                <w:rFonts w:ascii="Times New Roman" w:hAnsi="Times New Roman"/>
+                <w:b w:val="0"/>
+                <w:color w:val="000000"/>
+                <w:sz w:val="16"/>
+              </w:rPr>
+              <w:t>OpenQASM 3</w:t>
+            </w:r>
+          </w:p>
+        </w:tc>
+        <w:tc>
+          <w:tcPr>
+            <w:tcW w:type="dxa" w:w="3331"/>
+            <w:vAlign w:val="center"/>
+            <w:tcMar>
+              <w:top w:w="80" w:type="dxa"/>
+              <w:start w:w="80" w:type="dxa"/>
+              <w:bottom w:w="80" w:type="dxa"/>
+              <w:end w:w="80" w:type="dxa"/>
+            </w:tcMar>
+          </w:tcPr>
+          <w:p>
+            <w:pPr>
+              <w:spacing w:after="0" w:line="240" w:lineRule="auto"/>
               <w:jc w:val="left"/>
             </w:pPr>
             <w:r>
@@ -5304,7 +5571,6 @@
         <w:tc>
           <w:tcPr>
             <w:tcW w:type="dxa" w:w="3331"/>
-            <w:shd w:fill="EAF2F8"/>
             <w:vAlign w:val="center"/>
             <w:tcMar>
               <w:top w:w="80" w:type="dxa"/>
@@ -5700,7 +5966,7 @@
           <w:color w:val="000000"/>
           <w:sz w:val="21"/>
         </w:rPr>
-        <w:t>The earlier hot-stage DWSIM run resolved three-stage compression, a 420 C palladium heater, coolers, and Peng-Robinson closure for the preceding input set. The present corrected deck could not be executed under the host DLL policy, so Figure 13 documents the method and equipment structure rather than current energy numbers. Published 22 bar inhibition and 26 bar, 400 C endurance studies [23,24] independently support the pressure-temperature feasibility envelope but do not certify the final impurity vector.</w:t>
+        <w:t>The corrected DWSIM run resolves the current 6.2 bar pressure basis, compressor duties, temperatures, and Peng-Robinson closure, as shown in Figure 8. Figure 13 retains the earlier 420 C heater and heat-integration structure for the preceding input set and is not used for current energy numbers. Published 22 bar inhibition and 26 bar, 400 C endurance studies [23,24] independently support the high-temperature feasibility envelope but do not certify the final impurity vector.</w:t>
       </w:r>
     </w:p>
     <w:p>
@@ -5764,7 +6030,7 @@
           <w:color w:val="000000"/>
           <w:sz w:val="18"/>
         </w:rPr>
-        <w:t>Earlier hot-stage DWSIM equipment and heat-integration audit retained as a structural method cross-check; corrected-input execution is pending.</w:t>
+        <w:t>Earlier hot-stage DWSIM equipment and heat-integration audit retained as structural evidence for the 420 C palladium stage; current corrected compression results are reported in Figure 8.</w:t>
       </w:r>
     </w:p>
     <w:p>
@@ -7274,7 +7540,7 @@
           <w:color w:val="000000"/>
           <w:sz w:val="21"/>
         </w:rPr>
-        <w:t>The main limitations are the uniform engineering uncertainty measure, transfer of adsorption and membrane parameters across apparatuses, common constitutive laws in DOP853 and RK4, absence of a corrected-input DWSIM execution on the restricted host, lack of device-specific quantum routing and execution, and the lack of a matched component-resolved integrated experiment. Public membrane studies establish feasibility, recovery scale, degradation stresses, and rejection cases, but their feeds, pressures, modules, and analytical resolutions differ. These boundaries define the next validation work and do not change the pressure-consistent numerical design decision reported here.</w:t>
+        <w:t>The main limitations are the uniform engineering uncertainty measure, transfer of adsorption and membrane parameters across apparatuses, common constitutive laws in DOP853 and RK4, use of supplied horizon-averaged membrane split fractions in DWSIM, lack of device-specific quantum routing and execution, and the lack of a matched component-resolved integrated experiment. Public membrane studies establish feasibility, recovery scale, degradation stresses, and rejection cases, but their feeds, pressures, modules, and analytical resolutions differ. These boundaries define the next validation work and do not change the pressure-consistent numerical design decision reported here.</w:t>
       </w:r>
     </w:p>
     <w:p>
@@ -7327,7 +7593,7 @@
           <w:color w:val="000000"/>
           <w:sz w:val="21"/>
         </w:rPr>
-        <w:t>The physical chance event at 0.440 m2 has conservative continuous probability 0.951210 and 10-bit discrete probability 0.950629 with no direct label errors. The verified portable oracle requires 66 logical qubits and has an exact pre-routing count of 24,042 CX gates. RQMC remains preferred for the present model; QAE becomes relevant when validated plant uncertainty and repeated probability queries make classical event evaluation expensive. Device-specific quantum execution, a corrected-input DWSIM solve, and a synchronized integrated experiment remain external validation steps.</w:t>
+        <w:t>The corrected DWSIM calculation solved all 16 horizon-averaged cases and quantified the adiabatic compression penalty above the isothermal screen. The physical chance event at 0.440 m2 has conservative continuous probability 0.951210 and 10-bit discrete probability 0.950629 with no direct label errors. The verified portable oracle requires 66 logical qubits and has an exact pre-routing count of 24,042 CX gates. RQMC remains preferred for the present model; QAE becomes relevant when validated plant uncertainty and repeated probability queries make classical event evaluation expensive. Device-specific quantum execution and a synchronized integrated experiment remain external validation steps.</w:t>
       </w:r>
     </w:p>
     <w:p>
@@ -7396,7 +7662,7 @@
           <w:color w:val="000000"/>
           <w:sz w:val="21"/>
         </w:rPr>
-        <w:t>The complete calculation records, direct states, portable OpenQASM circuit, DWSIM input deck, figures, tables, and SHA-256 manifests are archived under the version-independent repository DOI https://doi.org/10.5281/zenodo.23271866 and mirrored at https://github.com/lyullee/psa-qae-resource-audit.</w:t>
+        <w:t>The complete calculation records, direct states, portable OpenQASM circuit, corrected DWSIM input and results, figures, tables, and SHA-256 manifests are archived under the version-independent repository DOI https://doi.org/10.5281/zenodo.23271866 and mirrored at https://github.com/lyullee/psa-qae-resource-audit.</w:t>
       </w:r>
     </w:p>
     <w:p>

</xml_diff>

<commit_message>
Add final-event IBM QPU probe and manuscript v0.2.2
</commit_message>
<xml_diff>
--- a/manuscript/SPT_PRESSURE_CONSISTENT_MANUSCRIPT.docx
+++ b/manuscript/SPT_PRESSURE_CONSISTENT_MANUSCRIPT.docx
@@ -80,7 +80,7 @@
           <w:color w:val="000000"/>
           <w:sz w:val="21"/>
         </w:rPr>
-        <w:t>Hydrogen pressure swing adsorption must retain product gas for the next purge and repressurization steps before gas can be sold. This work formulates that allocation as a continuous qualified-shipment problem and enforces pressure feasibility between a four-bed PSA, a finite regeneration tank, valves, and a polishing train. A pressure audit showed that the preliminary 7.0 bar tank could not be passively refilled from a 6.2 bar product manifold. The corrected topology therefore uses a 6.0 bar regulated tank, a 0.2 bar fill driving margin, and a discharge booster to the 6.5 bar regeneration header. Within declared feed, adsorption-equilibrium, and kinetic uncertainty, the selected policy of 4 s active purge and 540 s adsorption passed all eight corner cases and all eight predeclared interior hold-outs; a 6 s, 480 s comparison passed none. Specification-qualified hydrogen shipment increased by 6.785-7.341%, the minimum reserve-margin gain was 0.542 bar, and conservative booster duty remained below 0.198 kWh kg-1 H2. A literature-parameterized polymer concentrator followed by dense palladium polishing passed all 16 direct cases. Adaptive DOP853 integration corrected a near-boundary 20%-permeance-loss guard from 0.553 to 0.554 m2; the revised design gave at least 88.322% recovery and maximum CO, CO2, N2, and CH4 contents of 0.121, 4.000, 48.83, and 25.07 ppm. A public actual-syngas 50%-permeance-retention stress increased the conditional installed area to 0.887 m2 and retained all 16 cases. A separately coded fixed-area RK4 solver reproduced all 32 design-case labels, with a maximum recovery difference below 9.4e-8 percentage point relative to DOP853. A corrected DWSIM 8.7.1 Peng-Robinson calculation solved all 16 horizon-averaged cases at the 6.2 bar inlet, with maximum component-balance error 8.95e-19 mol s-1 and compression demand of 3.091-3.183 kWh kg-1 H2. For a 0.440 m2 chance design, error-buffered trilinear integration gave a minimum scrambled-Sobol probability of 0.956673; a conservative affine event gave 0.951210, and its 10-bit discretization gave 0.950629 with no direct label errors. An exact portable OpenQASM 3 oracle uses 66 logical qubits, 24,042 CX gates, 61,269 primitive gates, and all-to-all depth 36,163 before optimization or routing. Exhaustive 2-, 3-, and 4-bit checks plus direct and random 10-bit checks gave zero phase-label and work-qubit-restoration errors. For this smooth three-variable event, randomized quasi-Monte Carlo remains the practical estimator. The contribution is a pressure-consistent separation design rule and an auditable process-to-oracle construction for future higher-dimensional plant uncertainty.</w:t>
+        <w:t>Hydrogen pressure swing adsorption must retain product gas for the next purge and repressurization steps before gas can be sold. This work formulates that allocation as a continuous qualified-shipment problem and enforces pressure feasibility between a four-bed PSA, a finite regeneration tank, valves, and a polishing train. A pressure audit showed that the preliminary 7.0 bar tank could not be passively refilled from a 6.2 bar product manifold. The corrected topology therefore uses a 6.0 bar regulated tank, a 0.2 bar fill driving margin, and a discharge booster to the 6.5 bar regeneration header. Within declared feed, adsorption-equilibrium, and kinetic uncertainty, the selected policy of 4 s active purge and 540 s adsorption passed all eight corner cases and all eight predeclared interior hold-outs; a 6 s, 480 s comparison passed none. Specification-qualified hydrogen shipment increased by 6.785-7.341%, the minimum reserve-margin gain was 0.542 bar, and conservative booster duty remained below 0.198 kWh kg-1 H2. A literature-parameterized polymer concentrator followed by dense palladium polishing passed all 16 direct cases. Adaptive DOP853 integration corrected a near-boundary 20%-permeance-loss guard from 0.553 to 0.554 m2; the revised design gave at least 88.322% recovery and maximum CO, CO2, N2, and CH4 contents of 0.121, 4.000, 48.83, and 25.07 ppm. A public actual-syngas 50%-permeance-retention stress increased the conditional installed area to 0.887 m2 and retained all 16 cases. A separately coded fixed-area RK4 solver reproduced all 32 design-case labels, with a maximum recovery difference below 9.4e-8 percentage point relative to DOP853. A corrected DWSIM 8.7.1 Peng-Robinson calculation solved all 16 horizon-averaged cases at the 6.2 bar inlet, with maximum component-balance error 8.95e-19 mol s-1 and compression demand of 3.091-3.183 kWh kg-1 H2. For a 0.440 m2 chance design, error-buffered trilinear integration gave a minimum scrambled-Sobol probability of 0.956673; a conservative affine event gave 0.951210, and its 10-bit discretization gave 0.950629 with no direct label errors. An exact portable OpenQASM 3 oracle uses 66 logical qubits, 24,042 CX gates, 61,269 primitive gates, and all-to-all depth 36,163 before optimization or routing. Exhaustive 2-, 3-, and 4-bit checks plus direct and random 10-bit checks gave zero phase-label and work-qubit-restoration errors. An exact seven-qubit Boolean compilation of the final event at two-bit-per-variable resolution was then run on IBM Kingston for all 64 input states at 256 shots per state. All 64 states were majority-correct, the mean expected-label probability was 0.8389, and the job used 7 QPU s. For this smooth three-variable event, randomized quasi-Monte Carlo remains the practical estimator. The contribution is a pressure-consistent separation design rule, an auditable process-to-oracle construction, and a device-level truth-mapping test of the final event for future higher-dimensional plant uncertainty.</w:t>
       </w:r>
     </w:p>
     <w:p>
@@ -238,6 +238,20 @@
     </w:p>
     <w:p>
       <w:pPr>
+        <w:pStyle w:val="ListBullet"/>
+        <w:spacing w:after="40"/>
+      </w:pPr>
+      <w:r>
+        <w:rPr>
+          <w:rFonts w:ascii="Times New Roman" w:hAnsi="Times New Roman"/>
+          <w:color w:val="000000"/>
+          <w:sz w:val="21"/>
+        </w:rPr>
+        <w:t>A final-event IBM QPU probe classifies all 64 two-bit states correctly by majority vote</w:t>
+      </w:r>
+    </w:p>
+    <w:p>
+      <w:pPr>
         <w:pStyle w:val="Heading1"/>
       </w:pPr>
       <w:r>
@@ -316,7 +330,7 @@
           <w:color w:val="000000"/>
           <w:sz w:val="21"/>
         </w:rPr>
-        <w:t>This study combines a pressure-consistent four-bed PSA, finite regeneration inventory, staged membrane polishing, uncertainty propagation, and a quantum-ready chance event. The model is checked against a public four-bed hydrogen VPSA experiment [8], 468 public Pd-Ag H2/N2 flux records [22], high-pressure and mixed-gas palladium studies [23-29], and an integrated membrane-reactor/PSA study [30]. Adaptive DOP853 and separately coded fixed-area RK4 calculations test numerical sensitivity. The contribution is an engineering operating rule and a reproducible probability event; present quantum advantage and direct certification of the integrated apparatus are outside the claim.</w:t>
+        <w:t>This study combines a pressure-consistent four-bed PSA, finite regeneration inventory, staged membrane polishing, uncertainty propagation, and a quantum-ready chance event. The model is checked against a public four-bed hydrogen VPSA experiment [8], 468 public Pd-Ag H2/N2 flux records [22], high-pressure and mixed-gas palladium studies [23-29], and an integrated membrane-reactor/PSA study [30]. Adaptive DOP853 and separately coded fixed-area RK4 calculations test numerical sensitivity. The final event is serialized as a full portable arithmetic oracle, and its exact two-bit Boolean reduction is tested over every input on an IBM QPU. The contribution is an engineering operating rule and a reproducible probability event with device-level truth-mapping evidence; present quantum advantage and direct certification of the integrated apparatus are outside the claim.</w:t>
       </w:r>
     </w:p>
     <w:p>
@@ -533,7 +547,7 @@
           <w:color w:val="000000"/>
           <w:sz w:val="21"/>
         </w:rPr>
-        <w:t>Installed dense-palladium area is the physical design coordinate. At 0.440 m2, 13 of 16 direct stress cases pass while the continuous chance probability exceeds 0.95. A conservative affine event is checked against every direct label and digitized with 10 qubits for each of three uncertainty coordinates. Reversible signed accumulation and comparison require 66 logical qubits. The circuit follows source-equivalent weighted-adder and two's-complement comparator constructions and is expanded exactly to OpenQASM 3 using X, H, T, Tdg, Z, and CX. Its portable unoptimized resources are 24,042 CX gates, 61,269 total primitive gates, and all-to-all depth 36,163. These counts exclude device routing, error correction, and hardware calibration.</w:t>
+        <w:t>Installed dense-palladium area is the physical design coordinate. At 0.440 m2, 13 of 16 direct stress cases pass while the continuous chance probability exceeds 0.95. A conservative affine event is checked against every direct label and digitized with 10 qubits for each of three uncertainty coordinates. Reversible signed accumulation and comparison require 66 logical qubits. The circuit follows source-equivalent weighted-adder and two's-complement comparator constructions and is expanded exactly to OpenQASM 3 using X, H, T, Tdg, Z, and CX. Its portable unoptimized resources are 24,042 CX gates, 61,269 total primitive gates, and all-to-all depth 36,163. These counts exclude device routing, error correction, and hardware calibration. For a device-level unit test tied to the same final affine inequality, each uncertainty coordinate is also digitized with two bits. The resulting 64-state event is compiled exactly from the failing complement into three disjoint Boolean cubes, reducing the basis-state truth-mapping test from a 42-qubit arithmetic realization to six input qubits and one flag. Both initial flag values are checked locally over all 128 reversible basis mappings. All 64 zero-flag input states are then transpiled at optimization level 3 and measured with 256 shots per state on the free IBM Open Plan. This compact compilation preserves the two-bit truth table but does not perform coherent amplitude estimation.</w:t>
       </w:r>
     </w:p>
     <w:p>
@@ -3067,6 +3081,120 @@
           </w:p>
         </w:tc>
       </w:tr>
+      <w:tr>
+        <w:tc>
+          <w:tcPr>
+            <w:tcW w:type="dxa" w:w="2498"/>
+            <w:shd w:fill="EAF2F8"/>
+            <w:vAlign w:val="center"/>
+            <w:tcMar>
+              <w:top w:w="80" w:type="dxa"/>
+              <w:start w:w="80" w:type="dxa"/>
+              <w:bottom w:w="80" w:type="dxa"/>
+              <w:end w:w="80" w:type="dxa"/>
+            </w:tcMar>
+          </w:tcPr>
+          <w:p>
+            <w:pPr>
+              <w:spacing w:after="0" w:line="240" w:lineRule="auto"/>
+              <w:jc w:val="left"/>
+            </w:pPr>
+            <w:r>
+              <w:rPr>
+                <w:rFonts w:ascii="Times New Roman" w:hAnsi="Times New Roman"/>
+                <w:b w:val="0"/>
+                <w:color w:val="000000"/>
+                <w:sz w:val="16"/>
+              </w:rPr>
+              <w:t>IBM final-event probe</w:t>
+            </w:r>
+          </w:p>
+        </w:tc>
+        <w:tc>
+          <w:tcPr>
+            <w:tcW w:type="dxa" w:w="2498"/>
+            <w:shd w:fill="EAF2F8"/>
+            <w:vAlign w:val="center"/>
+            <w:tcMar>
+              <w:top w:w="80" w:type="dxa"/>
+              <w:start w:w="80" w:type="dxa"/>
+              <w:bottom w:w="80" w:type="dxa"/>
+              <w:end w:w="80" w:type="dxa"/>
+            </w:tcMar>
+          </w:tcPr>
+          <w:p>
+            <w:pPr>
+              <w:spacing w:after="0" w:line="240" w:lineRule="auto"/>
+              <w:jc w:val="left"/>
+            </w:pPr>
+            <w:r>
+              <w:rPr>
+                <w:rFonts w:ascii="Times New Roman" w:hAnsi="Times New Roman"/>
+                <w:b w:val="0"/>
+                <w:color w:val="000000"/>
+                <w:sz w:val="16"/>
+              </w:rPr>
+              <w:t>64/64 majority correct</w:t>
+            </w:r>
+          </w:p>
+        </w:tc>
+        <w:tc>
+          <w:tcPr>
+            <w:tcW w:type="dxa" w:w="2498"/>
+            <w:shd w:fill="EAF2F8"/>
+            <w:vAlign w:val="center"/>
+            <w:tcMar>
+              <w:top w:w="80" w:type="dxa"/>
+              <w:start w:w="80" w:type="dxa"/>
+              <w:bottom w:w="80" w:type="dxa"/>
+              <w:end w:w="80" w:type="dxa"/>
+            </w:tcMar>
+          </w:tcPr>
+          <w:p>
+            <w:pPr>
+              <w:spacing w:after="0" w:line="240" w:lineRule="auto"/>
+              <w:jc w:val="center"/>
+            </w:pPr>
+            <w:r>
+              <w:rPr>
+                <w:rFonts w:ascii="Times New Roman" w:hAnsi="Times New Roman"/>
+                <w:b w:val="0"/>
+                <w:color w:val="000000"/>
+                <w:sz w:val="16"/>
+              </w:rPr>
+              <w:t>Two-bit truth mapping</w:t>
+            </w:r>
+          </w:p>
+        </w:tc>
+        <w:tc>
+          <w:tcPr>
+            <w:tcW w:type="dxa" w:w="2498"/>
+            <w:shd w:fill="EAF2F8"/>
+            <w:vAlign w:val="center"/>
+            <w:tcMar>
+              <w:top w:w="80" w:type="dxa"/>
+              <w:start w:w="80" w:type="dxa"/>
+              <w:bottom w:w="80" w:type="dxa"/>
+              <w:end w:w="80" w:type="dxa"/>
+            </w:tcMar>
+          </w:tcPr>
+          <w:p>
+            <w:pPr>
+              <w:spacing w:after="0" w:line="240" w:lineRule="auto"/>
+              <w:jc w:val="center"/>
+            </w:pPr>
+            <w:r>
+              <w:rPr>
+                <w:rFonts w:ascii="Times New Roman" w:hAnsi="Times New Roman"/>
+                <w:b w:val="0"/>
+                <w:color w:val="000000"/>
+                <w:sz w:val="16"/>
+              </w:rPr>
+              <w:t>No coherent QAE</w:t>
+            </w:r>
+          </w:p>
+        </w:tc>
+      </w:tr>
     </w:tbl>
     <w:p>
       <w:pPr>
@@ -4379,7 +4507,7 @@
           <w:color w:val="000000"/>
           <w:sz w:val="21"/>
         </w:rPr>
-        <w:t>At 0.440 m2 installed dense-palladium area, 13 of 16 direct points passed. The error-buffered trilinear probability had a minimum-scramble value of 0.956673; the conservative affine probability was 0.951210. Ten-bit digitization gave 0.950629, an absolute probability error of 0.000581, with zero false-positive and zero false-negative direct labels. The included OpenQASM 3 oracle uses 66 logical qubits, 24,042 CX gates, 61,269 primitive gates, and all-to-all depth 36,163 before optimization or routing. It produced zero phase-label and restoration errors in exhaustive 2-, 3-, and 4-bit tests, all 16 direct 10-bit engineering states, and 4,096 seeded random 10-bit states.</w:t>
+        <w:t>At 0.440 m2 installed dense-palladium area, 13 of 16 direct points passed. The error-buffered trilinear probability had a minimum-scramble value of 0.956673; the conservative affine probability was 0.951210. Ten-bit digitization gave 0.950629, an absolute probability error of 0.000581, with zero false-positive and zero false-negative direct labels. The included OpenQASM 3 oracle uses 66 logical qubits, 24,042 CX gates, 61,269 primitive gates, and all-to-all depth 36,163 before optimization or routing. It produced zero phase-label and restoration errors in exhaustive 2-, 3-, and 4-bit tests, all 16 direct 10-bit engineering states, and 4,096 seeded random 10-bit states. The exact two-bit final-event compilation used seven logical qubits and was routed to 80-179 CZ gates with depth 244-456 on IBM Kingston. Job db6emt04qg6s73c4lja0 tested all 64 inputs at 256 shots per state. Every state was majority-correct; expected-label probability averaged 0.8389 and ranged from 0.6523 to 0.9297. The job consumed 7 QPU s, and a separate read-only retrieval exactly reproduced all 64 archived count dictionaries. Figure 9 separates this hardware truth-mapping result from the full-oracle resource boundary.</w:t>
       </w:r>
     </w:p>
     <w:p>
@@ -5596,6 +5724,261 @@
           </w:p>
         </w:tc>
       </w:tr>
+      <w:tr>
+        <w:tc>
+          <w:tcPr>
+            <w:tcW w:type="dxa" w:w="3331"/>
+            <w:shd w:fill="EAF2F8"/>
+            <w:vAlign w:val="center"/>
+            <w:tcMar>
+              <w:top w:w="80" w:type="dxa"/>
+              <w:start w:w="80" w:type="dxa"/>
+              <w:bottom w:w="80" w:type="dxa"/>
+              <w:end w:w="80" w:type="dxa"/>
+            </w:tcMar>
+          </w:tcPr>
+          <w:p>
+            <w:pPr>
+              <w:spacing w:after="0" w:line="240" w:lineRule="auto"/>
+              <w:jc w:val="left"/>
+            </w:pPr>
+            <w:r>
+              <w:rPr>
+                <w:rFonts w:ascii="Times New Roman" w:hAnsi="Times New Roman"/>
+                <w:b w:val="0"/>
+                <w:color w:val="000000"/>
+                <w:sz w:val="16"/>
+              </w:rPr>
+              <w:t>IBM Kingston</w:t>
+            </w:r>
+          </w:p>
+        </w:tc>
+        <w:tc>
+          <w:tcPr>
+            <w:tcW w:type="dxa" w:w="3331"/>
+            <w:shd w:fill="EAF2F8"/>
+            <w:vAlign w:val="center"/>
+            <w:tcMar>
+              <w:top w:w="80" w:type="dxa"/>
+              <w:start w:w="80" w:type="dxa"/>
+              <w:bottom w:w="80" w:type="dxa"/>
+              <w:end w:w="80" w:type="dxa"/>
+            </w:tcMar>
+          </w:tcPr>
+          <w:p>
+            <w:pPr>
+              <w:spacing w:after="0" w:line="240" w:lineRule="auto"/>
+              <w:jc w:val="left"/>
+            </w:pPr>
+            <w:r>
+              <w:rPr>
+                <w:rFonts w:ascii="Times New Roman" w:hAnsi="Times New Roman"/>
+                <w:b w:val="0"/>
+                <w:color w:val="000000"/>
+                <w:sz w:val="16"/>
+              </w:rPr>
+              <w:t>Two-bit states / shots</w:t>
+            </w:r>
+          </w:p>
+        </w:tc>
+        <w:tc>
+          <w:tcPr>
+            <w:tcW w:type="dxa" w:w="3331"/>
+            <w:shd w:fill="EAF2F8"/>
+            <w:vAlign w:val="center"/>
+            <w:tcMar>
+              <w:top w:w="80" w:type="dxa"/>
+              <w:start w:w="80" w:type="dxa"/>
+              <w:bottom w:w="80" w:type="dxa"/>
+              <w:end w:w="80" w:type="dxa"/>
+            </w:tcMar>
+          </w:tcPr>
+          <w:p>
+            <w:pPr>
+              <w:spacing w:after="0" w:line="240" w:lineRule="auto"/>
+              <w:jc w:val="center"/>
+            </w:pPr>
+            <w:r>
+              <w:rPr>
+                <w:rFonts w:ascii="Times New Roman" w:hAnsi="Times New Roman"/>
+                <w:b w:val="0"/>
+                <w:color w:val="000000"/>
+                <w:sz w:val="16"/>
+              </w:rPr>
+              <w:t>64 / 256 each</w:t>
+            </w:r>
+          </w:p>
+        </w:tc>
+      </w:tr>
+      <w:tr>
+        <w:tc>
+          <w:tcPr>
+            <w:tcW w:type="dxa" w:w="3331"/>
+            <w:vAlign w:val="center"/>
+            <w:tcMar>
+              <w:top w:w="80" w:type="dxa"/>
+              <w:start w:w="80" w:type="dxa"/>
+              <w:bottom w:w="80" w:type="dxa"/>
+              <w:end w:w="80" w:type="dxa"/>
+            </w:tcMar>
+          </w:tcPr>
+          <w:p>
+            <w:pPr>
+              <w:spacing w:after="0" w:line="240" w:lineRule="auto"/>
+              <w:jc w:val="left"/>
+            </w:pPr>
+            <w:r>
+              <w:rPr>
+                <w:rFonts w:ascii="Times New Roman" w:hAnsi="Times New Roman"/>
+                <w:b w:val="0"/>
+                <w:color w:val="000000"/>
+                <w:sz w:val="16"/>
+              </w:rPr>
+              <w:t>IBM Kingston</w:t>
+            </w:r>
+          </w:p>
+        </w:tc>
+        <w:tc>
+          <w:tcPr>
+            <w:tcW w:type="dxa" w:w="3331"/>
+            <w:vAlign w:val="center"/>
+            <w:tcMar>
+              <w:top w:w="80" w:type="dxa"/>
+              <w:start w:w="80" w:type="dxa"/>
+              <w:bottom w:w="80" w:type="dxa"/>
+              <w:end w:w="80" w:type="dxa"/>
+            </w:tcMar>
+          </w:tcPr>
+          <w:p>
+            <w:pPr>
+              <w:spacing w:after="0" w:line="240" w:lineRule="auto"/>
+              <w:jc w:val="left"/>
+            </w:pPr>
+            <w:r>
+              <w:rPr>
+                <w:rFonts w:ascii="Times New Roman" w:hAnsi="Times New Roman"/>
+                <w:b w:val="0"/>
+                <w:color w:val="000000"/>
+                <w:sz w:val="16"/>
+              </w:rPr>
+              <w:t>Expected-label probability</w:t>
+            </w:r>
+          </w:p>
+        </w:tc>
+        <w:tc>
+          <w:tcPr>
+            <w:tcW w:type="dxa" w:w="3331"/>
+            <w:vAlign w:val="center"/>
+            <w:tcMar>
+              <w:top w:w="80" w:type="dxa"/>
+              <w:start w:w="80" w:type="dxa"/>
+              <w:bottom w:w="80" w:type="dxa"/>
+              <w:end w:w="80" w:type="dxa"/>
+            </w:tcMar>
+          </w:tcPr>
+          <w:p>
+            <w:pPr>
+              <w:spacing w:after="0" w:line="240" w:lineRule="auto"/>
+              <w:jc w:val="left"/>
+            </w:pPr>
+            <w:r>
+              <w:rPr>
+                <w:rFonts w:ascii="Times New Roman" w:hAnsi="Times New Roman"/>
+                <w:b w:val="0"/>
+                <w:color w:val="000000"/>
+                <w:sz w:val="16"/>
+              </w:rPr>
+              <w:t>mean 0.8389; min 0.6523</w:t>
+            </w:r>
+          </w:p>
+        </w:tc>
+      </w:tr>
+      <w:tr>
+        <w:tc>
+          <w:tcPr>
+            <w:tcW w:type="dxa" w:w="3331"/>
+            <w:shd w:fill="EAF2F8"/>
+            <w:vAlign w:val="center"/>
+            <w:tcMar>
+              <w:top w:w="80" w:type="dxa"/>
+              <w:start w:w="80" w:type="dxa"/>
+              <w:bottom w:w="80" w:type="dxa"/>
+              <w:end w:w="80" w:type="dxa"/>
+            </w:tcMar>
+          </w:tcPr>
+          <w:p>
+            <w:pPr>
+              <w:spacing w:after="0" w:line="240" w:lineRule="auto"/>
+              <w:jc w:val="left"/>
+            </w:pPr>
+            <w:r>
+              <w:rPr>
+                <w:rFonts w:ascii="Times New Roman" w:hAnsi="Times New Roman"/>
+                <w:b w:val="0"/>
+                <w:color w:val="000000"/>
+                <w:sz w:val="16"/>
+              </w:rPr>
+              <w:t>IBM Kingston</w:t>
+            </w:r>
+          </w:p>
+        </w:tc>
+        <w:tc>
+          <w:tcPr>
+            <w:tcW w:type="dxa" w:w="3331"/>
+            <w:shd w:fill="EAF2F8"/>
+            <w:vAlign w:val="center"/>
+            <w:tcMar>
+              <w:top w:w="80" w:type="dxa"/>
+              <w:start w:w="80" w:type="dxa"/>
+              <w:bottom w:w="80" w:type="dxa"/>
+              <w:end w:w="80" w:type="dxa"/>
+            </w:tcMar>
+          </w:tcPr>
+          <w:p>
+            <w:pPr>
+              <w:spacing w:after="0" w:line="240" w:lineRule="auto"/>
+              <w:jc w:val="center"/>
+            </w:pPr>
+            <w:r>
+              <w:rPr>
+                <w:rFonts w:ascii="Times New Roman" w:hAnsi="Times New Roman"/>
+                <w:b w:val="0"/>
+                <w:color w:val="000000"/>
+                <w:sz w:val="16"/>
+              </w:rPr>
+              <w:t>QPU usage</w:t>
+            </w:r>
+          </w:p>
+        </w:tc>
+        <w:tc>
+          <w:tcPr>
+            <w:tcW w:type="dxa" w:w="3331"/>
+            <w:shd w:fill="EAF2F8"/>
+            <w:vAlign w:val="center"/>
+            <w:tcMar>
+              <w:top w:w="80" w:type="dxa"/>
+              <w:start w:w="80" w:type="dxa"/>
+              <w:bottom w:w="80" w:type="dxa"/>
+              <w:end w:w="80" w:type="dxa"/>
+            </w:tcMar>
+          </w:tcPr>
+          <w:p>
+            <w:pPr>
+              <w:spacing w:after="0" w:line="240" w:lineRule="auto"/>
+              <w:jc w:val="left"/>
+            </w:pPr>
+            <w:r>
+              <w:rPr>
+                <w:rFonts w:ascii="Times New Roman" w:hAnsi="Times New Roman"/>
+                <w:b w:val="0"/>
+                <w:color w:val="000000"/>
+                <w:sz w:val="16"/>
+              </w:rPr>
+              <w:t>7 s; 64/64 majority correct</w:t>
+            </w:r>
+          </w:p>
+        </w:tc>
+      </w:tr>
     </w:tbl>
     <w:p>
       <w:pPr>
@@ -5611,7 +5994,7 @@
       <w:r>
         <w:drawing>
           <wp:inline xmlns:a="http://schemas.openxmlformats.org/drawingml/2006/main" xmlns:pic="http://schemas.openxmlformats.org/drawingml/2006/picture">
-            <wp:extent cx="6080760" cy="1746394"/>
+            <wp:extent cx="6080760" cy="1874901"/>
             <wp:docPr id="9" name="Picture 9"/>
             <wp:cNvGraphicFramePr>
               <a:graphicFrameLocks noChangeAspect="1"/>
@@ -5620,7 +6003,7 @@
               <a:graphicData uri="http://schemas.openxmlformats.org/drawingml/2006/picture">
                 <pic:pic>
                   <pic:nvPicPr>
-                    <pic:cNvPr id="0" name="Fig_pressure_consistent_portable_qasm_oracle_v1.png"/>
+                    <pic:cNvPr id="0" name="Fig_qae_oracle_and_ibm_hardware_v2.png"/>
                     <pic:cNvPicPr/>
                   </pic:nvPicPr>
                   <pic:blipFill>
@@ -5632,7 +6015,7 @@
                   <pic:spPr>
                     <a:xfrm>
                       <a:off x="0" y="0"/>
-                      <a:ext cx="6080760" cy="1746394"/>
+                      <a:ext cx="6080760" cy="1874901"/>
                     </a:xfrm>
                     <a:prstGeom prst="rect"/>
                   </pic:spPr>
@@ -5663,7 +6046,7 @@
           <w:color w:val="000000"/>
           <w:sz w:val="18"/>
         </w:rPr>
-        <w:t>Verified physical dense-palladium-area chance event and portable OpenQASM resource baseline. CX and depth are exact all-to-all counts before device optimization and routing.</w:t>
+        <w:t>Process chance event, portable OpenQASM resource boundary, and IBM QPU truth-mapping result. The full-oracle CX and depth values are exact all-to-all counts before device optimization and routing. The hardware panel reports all 64 states of the exact two-bit reduction of the final event at 256 shots per state; it is not a coherent QAE execution.</w:t>
       </w:r>
     </w:p>
     <w:p>
@@ -5678,7 +6061,7 @@
           <w:color w:val="000000"/>
           <w:sz w:val="21"/>
         </w:rPr>
-        <w:t>RQMC is still the practical estimator for this smooth three-variable event. The quantum construction supplies a reproducible Boolean event, integer coefficients, register layout, and discretization error. It becomes computationally interesting only when future plant-calibrated uncertainty is higher-dimensional, process evaluation is expensive, and repeated risk queries can reuse the same oracle.</w:t>
+        <w:t>RQMC is still the practical estimator for this smooth three-variable event. The quantum construction supplies a reproducible Boolean event, integer coefficients, register layout, discretization error, and a hardware-tested low-resolution truth mapping. The IBM result closes the software-to-device chain for the final event definition, but it does not test coherent superposition, amplitude amplification, or the 66-qubit arithmetic circuit. QAE becomes computationally interesting when future plant-calibrated uncertainty is higher-dimensional, process evaluation is expensive, and repeated risk queries can reuse the same oracle.</w:t>
       </w:r>
     </w:p>
     <w:p>
@@ -7516,7 +7899,7 @@
           <w:color w:val="000000"/>
           <w:sz w:val="21"/>
         </w:rPr>
-        <w:t>QAE is subordinate to the separation result. Current RQMC is cheaper for this three-dimensional response. The quantum contribution is the auditable reduction from a physical membrane-area chance constraint to a verified discrete reversible event with known probability error, a portable OpenQASM implementation, and explicit pre-routing resources. The 24,042-CX count is a reproducible upper-level resource baseline rather than an optimized device cost, and no hardware-advantage claim is made.</w:t>
+        <w:t>QAE is subordinate to the separation result. Current RQMC is cheaper for this three-dimensional response. The quantum contribution is the auditable reduction from a physical membrane-area chance constraint to a verified discrete reversible event with known probability error, a portable OpenQASM implementation, explicit pre-routing resources, and an IBM QPU test of every state in the exact two-bit final-event reduction. The 64/64 majority result shows that the engineering inequality can survive compilation, device routing, and measurement at low resolution. The 24,042-CX full-oracle count remains a reproducible resource baseline rather than an optimized device cost, and no hardware-advantage claim is made.</w:t>
       </w:r>
     </w:p>
     <w:p>
@@ -7540,7 +7923,7 @@
           <w:color w:val="000000"/>
           <w:sz w:val="21"/>
         </w:rPr>
-        <w:t>The main limitations are the uniform engineering uncertainty measure, transfer of adsorption and membrane parameters across apparatuses, common constitutive laws in DOP853 and RK4, use of supplied horizon-averaged membrane split fractions in DWSIM, lack of device-specific quantum routing and execution, and the lack of a matched component-resolved integrated experiment. Public membrane studies establish feasibility, recovery scale, degradation stresses, and rejection cases, but their feeds, pressures, modules, and analytical resolutions differ. These boundaries define the next validation work and do not change the pressure-consistent numerical design decision reported here.</w:t>
+        <w:t>The main limitations are the uniform engineering uncertainty measure, transfer of adsorption and membrane parameters across apparatuses, common constitutive laws in DOP853 and RK4, use of supplied horizon-averaged membrane split fractions in DWSIM, and the lack of a matched component-resolved integrated experiment. Device-specific execution is limited to a seven-qubit truth-table test at two-bit resolution; coherent QAE and the 42- and 66-logical-qubit arithmetic realizations were not run. The coarse two-bit uniform-grid fraction is therefore not used as the reported process probability. Public membrane studies establish feasibility, recovery scale, degradation stresses, and rejection cases, but their feeds, pressures, modules, and analytical resolutions differ. These boundaries define the next validation work and do not change the pressure-consistent numerical design decision reported here.</w:t>
       </w:r>
     </w:p>
     <w:p>
@@ -7593,7 +7976,7 @@
           <w:color w:val="000000"/>
           <w:sz w:val="21"/>
         </w:rPr>
-        <w:t>The corrected DWSIM calculation solved all 16 horizon-averaged cases and quantified the adiabatic compression penalty above the isothermal screen. The physical chance event at 0.440 m2 has conservative continuous probability 0.951210 and 10-bit discrete probability 0.950629 with no direct label errors. The verified portable oracle requires 66 logical qubits and has an exact pre-routing count of 24,042 CX gates. RQMC remains preferred for the present model; QAE becomes relevant when validated plant uncertainty and repeated probability queries make classical event evaluation expensive. Device-specific quantum execution and a synchronized integrated experiment remain external validation steps.</w:t>
+        <w:t>The corrected DWSIM calculation solved all 16 horizon-averaged cases and quantified the adiabatic compression penalty above the isothermal screen. The physical chance event at 0.440 m2 has conservative continuous probability 0.951210 and 10-bit discrete probability 0.950629 with no direct label errors. The verified portable oracle requires 66 logical qubits and has an exact pre-routing count of 24,042 CX gates. An exact seven-qubit reduction of the same final event classified all 64 two-bit inputs correctly by majority vote on IBM Kingston, with mean expected-label probability 0.8389 and 7 QPU s usage. This establishes a reproducible process-to-device path while leaving coherent QAE and full arithmetic-oracle execution as future work. RQMC remains preferred for the present model; QAE becomes relevant when validated plant uncertainty and repeated probability queries make classical event evaluation expensive. A synchronized integrated separation experiment remains the principal external validation step.</w:t>
       </w:r>
     </w:p>
     <w:p>

</xml_diff>

<commit_message>
Add public experimental hold-outs and SPT manuscript v0.2.3
</commit_message>
<xml_diff>
--- a/manuscript/SPT_PRESSURE_CONSISTENT_MANUSCRIPT.docx
+++ b/manuscript/SPT_PRESSURE_CONSISTENT_MANUSCRIPT.docx
@@ -80,7 +80,7 @@
           <w:color w:val="000000"/>
           <w:sz w:val="21"/>
         </w:rPr>
-        <w:t>Hydrogen pressure swing adsorption must retain product gas for the next purge and repressurization steps before gas can be sold. This work formulates that allocation as a continuous qualified-shipment problem and enforces pressure feasibility between a four-bed PSA, a finite regeneration tank, valves, and a polishing train. A pressure audit showed that the preliminary 7.0 bar tank could not be passively refilled from a 6.2 bar product manifold. The corrected topology therefore uses a 6.0 bar regulated tank, a 0.2 bar fill driving margin, and a discharge booster to the 6.5 bar regeneration header. Within declared feed, adsorption-equilibrium, and kinetic uncertainty, the selected policy of 4 s active purge and 540 s adsorption passed all eight corner cases and all eight predeclared interior hold-outs; a 6 s, 480 s comparison passed none. Specification-qualified hydrogen shipment increased by 6.785-7.341%, the minimum reserve-margin gain was 0.542 bar, and conservative booster duty remained below 0.198 kWh kg-1 H2. A literature-parameterized polymer concentrator followed by dense palladium polishing passed all 16 direct cases. Adaptive DOP853 integration corrected a near-boundary 20%-permeance-loss guard from 0.553 to 0.554 m2; the revised design gave at least 88.322% recovery and maximum CO, CO2, N2, and CH4 contents of 0.121, 4.000, 48.83, and 25.07 ppm. A public actual-syngas 50%-permeance-retention stress increased the conditional installed area to 0.887 m2 and retained all 16 cases. A separately coded fixed-area RK4 solver reproduced all 32 design-case labels, with a maximum recovery difference below 9.4e-8 percentage point relative to DOP853. A corrected DWSIM 8.7.1 Peng-Robinson calculation solved all 16 horizon-averaged cases at the 6.2 bar inlet, with maximum component-balance error 8.95e-19 mol s-1 and compression demand of 3.091-3.183 kWh kg-1 H2. For a 0.440 m2 chance design, error-buffered trilinear integration gave a minimum scrambled-Sobol probability of 0.956673; a conservative affine event gave 0.951210, and its 10-bit discretization gave 0.950629 with no direct label errors. An exact portable OpenQASM 3 oracle uses 66 logical qubits, 24,042 CX gates, 61,269 primitive gates, and all-to-all depth 36,163 before optimization or routing. Exhaustive 2-, 3-, and 4-bit checks plus direct and random 10-bit checks gave zero phase-label and work-qubit-restoration errors. An exact seven-qubit Boolean compilation of the final event at two-bit-per-variable resolution was then run on IBM Kingston for all 64 input states at 256 shots per state. All 64 states were majority-correct, the mean expected-label probability was 0.8389, and the job used 7 QPU s. For this smooth three-variable event, randomized quasi-Monte Carlo remains the practical estimator. The contribution is a pressure-consistent separation design rule, an auditable process-to-oracle construction, and a device-level truth-mapping test of the final event for future higher-dimensional plant uncertainty.</w:t>
+        <w:t>Hydrogen pressure swing adsorption must retain product gas for the next purge and repressurization steps before gas can be sold. This work formulates that allocation as a continuous qualified-shipment problem and enforces pressure feasibility between a four-bed PSA, a finite regeneration tank, valves, and a polishing train. A pressure audit showed that the preliminary 7.0 bar tank could not be passively refilled from a 6.2 bar product manifold. The corrected topology therefore uses a 6.0 bar regulated tank, a 0.2 bar fill driving margin, and a discharge booster to the 6.5 bar regeneration header. Within declared feed, adsorption-equilibrium, and kinetic uncertainty, the selected policy of 4 s active purge and 540 s adsorption passed all eight corner cases and all eight predeclared interior hold-outs; a 6 s, 480 s comparison passed none. Specification-qualified hydrogen shipment increased by 6.785-7.341%, the minimum reserve-margin gain was 0.542 bar, and conservative booster duty remained below 0.198 kWh kg-1 H2. A literature-parameterized polymer concentrator followed by dense palladium polishing passed all 16 direct cases. Adaptive DOP853 integration corrected a near-boundary 20%-permeance-loss guard from 0.553 to 0.554 m2; the revised design gave at least 88.322% recovery and maximum CO, CO2, N2, and CH4 contents of 0.121, 4.000, 48.83, and 25.07 ppm. A public actual-syngas 50%-permeance-retention stress increased the conditional installed area to 0.887 m2 and retained all 16 cases. A separately coded fixed-area RK4 solver reproduced all 32 design-case labels, with a maximum recovery difference below 9.4e-8 percentage point relative to DOP853. A corrected DWSIM 8.7.1 Peng-Robinson calculation solved all 16 horizon-averaged cases at the 6.2 bar inlet, with maximum component-balance error 8.95e-19 mol s-1 and compression demand of 3.091-3.183 kWh kg-1 H2. For a 0.440 m2 chance design, error-buffered trilinear integration gave a minimum scrambled-Sobol probability of 0.956673; a conservative affine event gave 0.951210, and its 10-bit discretization gave 0.950629 with no direct label errors. An exact portable OpenQASM 3 oracle uses 66 logical qubits, 24,042 CX gates, 61,269 primitive gates, and all-to-all depth 36,163 before optimization or routing. Exhaustive 2-, 3-, and 4-bit checks plus direct and random 10-bit checks gave zero phase-label and work-qubit-restoration errors. An exact seven-qubit Boolean compilation of the final event at two-bit-per-variable resolution was then run on IBM Kingston for all 64 input states at 256 shots per state. All 64 states were majority-correct, the mean expected-label probability was 0.8389, and the job used 7 QPU s. Two post-freeze public experimental hold-outs were then added without refitting. All 12 endpoint direction checks passed for a 13-run two-bed H2/CO2 VPSA campaign, while a four-bed transient H2/CH4 PSA campaign gave a purge/feed-recovery Spearman association of -0.758 and at least one purity-recovery pass in each of four feed stages. For this smooth three-variable event, randomized quasi-Monte Carlo remains the practical estimator. The contribution is a pressure-consistent separation design rule, an auditable process-to-oracle construction, and a device-level truth-mapping test of the final event for future higher-dimensional plant uncertainty.</w:t>
       </w:r>
     </w:p>
     <w:p>
@@ -330,7 +330,7 @@
           <w:color w:val="000000"/>
           <w:sz w:val="21"/>
         </w:rPr>
-        <w:t>This study combines a pressure-consistent four-bed PSA, finite regeneration inventory, staged membrane polishing, uncertainty propagation, and a quantum-ready chance event. The model is checked against a public four-bed hydrogen VPSA experiment [8], 468 public Pd-Ag H2/N2 flux records [22], high-pressure and mixed-gas palladium studies [23-29], and an integrated membrane-reactor/PSA study [30]. Adaptive DOP853 and separately coded fixed-area RK4 calculations test numerical sensitivity. The final event is serialized as a full portable arithmetic oracle, and its exact two-bit Boolean reduction is tested over every input on an IBM QPU. The contribution is an engineering operating rule and a reproducible probability event with device-level truth-mapping evidence; present quantum advantage and direct certification of the integrated apparatus are outside the claim.</w:t>
+        <w:t>This study combines a pressure-consistent four-bed PSA, finite regeneration inventory, staged membrane polishing, uncertainty propagation, and a quantum-ready chance event. The model is checked against a public four-bed hydrogen VPSA experiment [8], 468 public Pd-Ag H2/N2 flux records [22], high-pressure and mixed-gas palladium studies [23-29], and an integrated membrane-reactor/PSA study [30]. Two additional post-freeze public experiments provide a 13-run two-bed H2/CO2 VPSA directional hold-out [31] and a 13-run four-bed transient-feed H2/CH4 PSA event hold-out [32]. Adaptive DOP853 and separately coded fixed-area RK4 calculations test numerical sensitivity. The final event is serialized as a full portable arithmetic oracle, and its exact two-bit Boolean reduction is tested over every input on an IBM QPU. The contribution is an engineering operating rule and a reproducible probability event with device-level truth-mapping evidence; present quantum advantage and direct certification of the integrated apparatus are outside the claim.</w:t>
       </w:r>
     </w:p>
     <w:p>
@@ -785,6 +785,30 @@
           <w:sz w:val="21"/>
         </w:rPr>
         <w:t>A compiled C# packetwise implementation was previously used to verify the independent transport method on the preceding input set. The regenerated 6.0 bar train was not replayed because native execution is restricted on the current host. Its figure is retained to document the third-language method, but the current pressure-consistent claims rely on direct six-cell integration, DOP853, and the newly rerun Python RK4 calculation.</w:t>
+      </w:r>
+    </w:p>
+    <w:p>
+      <w:pPr>
+        <w:pStyle w:val="Heading2"/>
+        <w:keepNext/>
+      </w:pPr>
+      <w:r>
+        <w:t>3.13 Post-freeze public experimental hold-outs</w:t>
+      </w:r>
+    </w:p>
+    <w:p>
+      <w:pPr>
+        <w:spacing w:line="276" w:lineRule="auto" w:after="100"/>
+        <w:ind w:firstLine="317"/>
+        <w:jc w:val="both"/>
+      </w:pPr>
+      <w:r>
+        <w:rPr>
+          <w:rFonts w:ascii="Times New Roman" w:hAnsi="Times New Roman"/>
+          <w:color w:val="000000"/>
+          <w:sz w:val="21"/>
+        </w:rPr>
+        <w:t>The model coefficients, project product thresholds, and probability-event definition were frozen in repository release v0.2.2 before two additional public experimental records were integrated. Chen et al. reported 13 two-column H2/CO2 VPSA runs over feed H2 fractions of 25-75% and operating pressures of 1-5 kgf cm-2 [31]. The transfer contract was limited to 12 endpoint directions: at fixed feed composition, pressure should leave purity unchanged or increase it and should decrease recovery; at fixed pressure, increasing feed H2 should leave purity unchanged or increase it and should decrease recovery. Voigt reported 13 cyclic runs from a four-bed activated-carbon H2/CH4 PSA over four transient feed stages spanning 25-60 bara [32]. Its source-defined event combines Type 1 purity, meaning that CH4 did not exceed the 0.5 vol% analyzer limit, with H2 recovery of at least 70%. The transferred tests were a negative purge/feed-recovery association and at least one source-event pass in every feed stage. No parameter, threshold, or source outcome was used to refit the local process model. Because apparatuses, adsorbents, feeds, and analyzers differ, these are directional and event-structure hold-outs rather than pointwise validation of the final integrated apparatus.</w:t>
       </w:r>
     </w:p>
     <w:p>
@@ -2405,6 +2429,230 @@
                 <w:sz w:val="16"/>
               </w:rPr>
               <w:t>Different apparatus</w:t>
+            </w:r>
+          </w:p>
+        </w:tc>
+      </w:tr>
+      <w:tr>
+        <w:tc>
+          <w:tcPr>
+            <w:tcW w:type="dxa" w:w="2498"/>
+            <w:shd w:fill="EAF2F8"/>
+            <w:vAlign w:val="center"/>
+            <w:tcMar>
+              <w:top w:w="80" w:type="dxa"/>
+              <w:start w:w="80" w:type="dxa"/>
+              <w:bottom w:w="80" w:type="dxa"/>
+              <w:end w:w="80" w:type="dxa"/>
+            </w:tcMar>
+          </w:tcPr>
+          <w:p>
+            <w:pPr>
+              <w:spacing w:after="0" w:line="240" w:lineRule="auto"/>
+              <w:jc w:val="left"/>
+            </w:pPr>
+            <w:r>
+              <w:rPr>
+                <w:rFonts w:ascii="Times New Roman" w:hAnsi="Times New Roman"/>
+                <w:b w:val="0"/>
+                <w:color w:val="000000"/>
+                <w:sz w:val="16"/>
+              </w:rPr>
+              <w:t>Chen 13-run VPSA</w:t>
+            </w:r>
+          </w:p>
+        </w:tc>
+        <w:tc>
+          <w:tcPr>
+            <w:tcW w:type="dxa" w:w="2498"/>
+            <w:shd w:fill="EAF2F8"/>
+            <w:vAlign w:val="center"/>
+            <w:tcMar>
+              <w:top w:w="80" w:type="dxa"/>
+              <w:start w:w="80" w:type="dxa"/>
+              <w:bottom w:w="80" w:type="dxa"/>
+              <w:end w:w="80" w:type="dxa"/>
+            </w:tcMar>
+          </w:tcPr>
+          <w:p>
+            <w:pPr>
+              <w:spacing w:after="0" w:line="240" w:lineRule="auto"/>
+              <w:jc w:val="left"/>
+            </w:pPr>
+            <w:r>
+              <w:rPr>
+                <w:rFonts w:ascii="Times New Roman" w:hAnsi="Times New Roman"/>
+                <w:b w:val="0"/>
+                <w:color w:val="000000"/>
+                <w:sz w:val="16"/>
+              </w:rPr>
+              <w:t>12/12 endpoint directions</w:t>
+            </w:r>
+          </w:p>
+        </w:tc>
+        <w:tc>
+          <w:tcPr>
+            <w:tcW w:type="dxa" w:w="2498"/>
+            <w:shd w:fill="EAF2F8"/>
+            <w:vAlign w:val="center"/>
+            <w:tcMar>
+              <w:top w:w="80" w:type="dxa"/>
+              <w:start w:w="80" w:type="dxa"/>
+              <w:bottom w:w="80" w:type="dxa"/>
+              <w:end w:w="80" w:type="dxa"/>
+            </w:tcMar>
+          </w:tcPr>
+          <w:p>
+            <w:pPr>
+              <w:spacing w:after="0" w:line="240" w:lineRule="auto"/>
+              <w:jc w:val="left"/>
+            </w:pPr>
+            <w:r>
+              <w:rPr>
+                <w:rFonts w:ascii="Times New Roman" w:hAnsi="Times New Roman"/>
+                <w:b w:val="0"/>
+                <w:color w:val="000000"/>
+                <w:sz w:val="16"/>
+              </w:rPr>
+              <w:t>Purity-recovery trade-off</w:t>
+            </w:r>
+          </w:p>
+        </w:tc>
+        <w:tc>
+          <w:tcPr>
+            <w:tcW w:type="dxa" w:w="2498"/>
+            <w:shd w:fill="EAF2F8"/>
+            <w:vAlign w:val="center"/>
+            <w:tcMar>
+              <w:top w:w="80" w:type="dxa"/>
+              <w:start w:w="80" w:type="dxa"/>
+              <w:bottom w:w="80" w:type="dxa"/>
+              <w:end w:w="80" w:type="dxa"/>
+            </w:tcMar>
+          </w:tcPr>
+          <w:p>
+            <w:pPr>
+              <w:spacing w:after="0" w:line="240" w:lineRule="auto"/>
+              <w:jc w:val="left"/>
+            </w:pPr>
+            <w:r>
+              <w:rPr>
+                <w:rFonts w:ascii="Times New Roman" w:hAnsi="Times New Roman"/>
+                <w:b w:val="0"/>
+                <w:color w:val="000000"/>
+                <w:sz w:val="16"/>
+              </w:rPr>
+              <w:t>Different two-bed H2/CO2 rig</w:t>
+            </w:r>
+          </w:p>
+        </w:tc>
+      </w:tr>
+      <w:tr>
+        <w:tc>
+          <w:tcPr>
+            <w:tcW w:type="dxa" w:w="2498"/>
+            <w:vAlign w:val="center"/>
+            <w:tcMar>
+              <w:top w:w="80" w:type="dxa"/>
+              <w:start w:w="80" w:type="dxa"/>
+              <w:bottom w:w="80" w:type="dxa"/>
+              <w:end w:w="80" w:type="dxa"/>
+            </w:tcMar>
+          </w:tcPr>
+          <w:p>
+            <w:pPr>
+              <w:spacing w:after="0" w:line="240" w:lineRule="auto"/>
+              <w:jc w:val="left"/>
+            </w:pPr>
+            <w:r>
+              <w:rPr>
+                <w:rFonts w:ascii="Times New Roman" w:hAnsi="Times New Roman"/>
+                <w:b w:val="0"/>
+                <w:color w:val="000000"/>
+                <w:sz w:val="16"/>
+              </w:rPr>
+              <w:t>Voigt 13-run PSA</w:t>
+            </w:r>
+          </w:p>
+        </w:tc>
+        <w:tc>
+          <w:tcPr>
+            <w:tcW w:type="dxa" w:w="2498"/>
+            <w:vAlign w:val="center"/>
+            <w:tcMar>
+              <w:top w:w="80" w:type="dxa"/>
+              <w:start w:w="80" w:type="dxa"/>
+              <w:bottom w:w="80" w:type="dxa"/>
+              <w:end w:w="80" w:type="dxa"/>
+            </w:tcMar>
+          </w:tcPr>
+          <w:p>
+            <w:pPr>
+              <w:spacing w:after="0" w:line="240" w:lineRule="auto"/>
+              <w:jc w:val="left"/>
+            </w:pPr>
+            <w:r>
+              <w:rPr>
+                <w:rFonts w:ascii="Times New Roman" w:hAnsi="Times New Roman"/>
+                <w:b w:val="0"/>
+                <w:color w:val="000000"/>
+                <w:sz w:val="16"/>
+              </w:rPr>
+              <w:t>6/13 source-event passes</w:t>
+            </w:r>
+          </w:p>
+        </w:tc>
+        <w:tc>
+          <w:tcPr>
+            <w:tcW w:type="dxa" w:w="2498"/>
+            <w:vAlign w:val="center"/>
+            <w:tcMar>
+              <w:top w:w="80" w:type="dxa"/>
+              <w:start w:w="80" w:type="dxa"/>
+              <w:bottom w:w="80" w:type="dxa"/>
+              <w:end w:w="80" w:type="dxa"/>
+            </w:tcMar>
+          </w:tcPr>
+          <w:p>
+            <w:pPr>
+              <w:spacing w:after="0" w:line="240" w:lineRule="auto"/>
+              <w:jc w:val="left"/>
+            </w:pPr>
+            <w:r>
+              <w:rPr>
+                <w:rFonts w:ascii="Times New Roman" w:hAnsi="Times New Roman"/>
+                <w:b w:val="0"/>
+                <w:color w:val="000000"/>
+                <w:sz w:val="16"/>
+              </w:rPr>
+              <w:t>Purge allocation and feed transfer</w:t>
+            </w:r>
+          </w:p>
+        </w:tc>
+        <w:tc>
+          <w:tcPr>
+            <w:tcW w:type="dxa" w:w="2498"/>
+            <w:vAlign w:val="center"/>
+            <w:tcMar>
+              <w:top w:w="80" w:type="dxa"/>
+              <w:start w:w="80" w:type="dxa"/>
+              <w:bottom w:w="80" w:type="dxa"/>
+              <w:end w:w="80" w:type="dxa"/>
+            </w:tcMar>
+          </w:tcPr>
+          <w:p>
+            <w:pPr>
+              <w:spacing w:after="0" w:line="240" w:lineRule="auto"/>
+              <w:jc w:val="left"/>
+            </w:pPr>
+            <w:r>
+              <w:rPr>
+                <w:rFonts w:ascii="Times New Roman" w:hAnsi="Times New Roman"/>
+                <w:b w:val="0"/>
+                <w:color w:val="000000"/>
+                <w:sz w:val="16"/>
+              </w:rPr>
+              <w:t>0.5 vol% CH4 analyzer limit</w:t>
             </w:r>
           </w:p>
         </w:tc>
@@ -7701,7 +7949,7 @@
         <w:keepNext/>
       </w:pPr>
       <w:r>
-        <w:t>4.17 Third-language packetwise transport preserves every decision</w:t>
+        <w:t>4.17 Two post-freeze public experiments support the operating logic</w:t>
       </w:r>
     </w:p>
     <w:p>
@@ -7716,7 +7964,7 @@
           <w:color w:val="000000"/>
           <w:sz w:val="21"/>
         </w:rPr>
-        <w:t>The compiled C# replay previously demonstrated that the transport implementation could be reproduced without membrane split inputs. It belongs to the superseded input set and is not counted as current pressure-consistent confirmation. The corrected claim is instead supported by direct packetwise DOP853 and the independently coded RK4 result in Section 4.9.</w:t>
+        <w:t>All 12 Chen endpoint direction checks passed. At every feed composition, raising the reported pressure from 1 to 5 kgf cm-2 left H2 purity unchanged or increased it and reduced recovery; at every pressure, raising feed H2 from 25% to 75% produced the same directional pair. Across all 13 measured runs, purity and recovery had a descriptive Spearman association of -0.766 (p=0.0023), and none jointly reached the frozen project floors of 99.97% H2 and 88.294% recovery. Five center repetitions gave 99.588 +/- 0.326% purity and 17.386 +/- 0.591% recovery as mean +/- sample standard deviation. In the independent Voigt campaign, 6 of 13 cyclic runs passed the source-defined Type 1 plus 70% recovery event, with at least one pass in each of four transient feed stages. Purge/feed ratio and recovery had a descriptive Spearman association of -0.758 (p=0.0027), and duplicate breakthrough times differed by less than 3.3% according to the source. These post-freeze results support the purity-recovery trade-off, the recovery cost of purge allocation, feed-dependent cycle settings, and a joint event. The Voigt analyzer could not resolve 99.97% fuel-cell purity, so neither hold-out certifies the final ppm-level product gate.</w:t>
       </w:r>
     </w:p>
     <w:p>
@@ -7728,7 +7976,7 @@
       <w:r>
         <w:drawing>
           <wp:inline xmlns:a="http://schemas.openxmlformats.org/drawingml/2006/main" xmlns:pic="http://schemas.openxmlformats.org/drawingml/2006/picture">
-            <wp:extent cx="6080760" cy="4193628"/>
+            <wp:extent cx="6080760" cy="4417156"/>
             <wp:docPr id="19" name="Picture 19"/>
             <wp:cNvGraphicFramePr>
               <a:graphicFrameLocks noChangeAspect="1"/>
@@ -7737,7 +7985,7 @@
               <a:graphicData uri="http://schemas.openxmlformats.org/drawingml/2006/picture">
                 <pic:pic>
                   <pic:nvPicPr>
-                    <pic:cNvPr id="0" name="Fig_csharp_direct_transport_crosscheck_v1.png"/>
+                    <pic:cNvPr id="0" name="Fig_external_experimental_holdouts_v1.png"/>
                     <pic:cNvPicPr/>
                   </pic:nvPicPr>
                   <pic:blipFill>
@@ -7749,7 +7997,7 @@
                   <pic:spPr>
                     <a:xfrm>
                       <a:off x="0" y="0"/>
-                      <a:ext cx="6080760" cy="4193628"/>
+                      <a:ext cx="6080760" cy="4417156"/>
                     </a:xfrm>
                     <a:prstGeom prst="rect"/>
                   </pic:spPr>
@@ -7780,7 +8028,31 @@
           <w:color w:val="000000"/>
           <w:sz w:val="18"/>
         </w:rPr>
-        <w:t>Third-language packetwise method evidence from the superseded input set. It is not counted as current pressure-consistent confirmation.</w:t>
+        <w:t>Two post-freeze public experimental hold-outs. The Chen et al. two-column H2/CO2 VPSA data test pressure and feed-composition effects on purity and recovery; the Voigt four-bed H2/CH4 PSA data test purge allocation and source-defined joint-event feasibility across transient feed stages. No local model parameter or threshold was refitted.</w:t>
+      </w:r>
+    </w:p>
+    <w:p>
+      <w:pPr>
+        <w:pStyle w:val="Heading2"/>
+        <w:keepNext/>
+      </w:pPr>
+      <w:r>
+        <w:t>4.18 Third-language packetwise transport preserves every decision</w:t>
+      </w:r>
+    </w:p>
+    <w:p>
+      <w:pPr>
+        <w:spacing w:line="276" w:lineRule="auto" w:after="100"/>
+        <w:ind w:firstLine="317"/>
+        <w:jc w:val="both"/>
+      </w:pPr>
+      <w:r>
+        <w:rPr>
+          <w:rFonts w:ascii="Times New Roman" w:hAnsi="Times New Roman"/>
+          <w:color w:val="000000"/>
+          <w:sz w:val="21"/>
+        </w:rPr>
+        <w:t>The compiled C# replay previously demonstrated that the transport implementation could be reproduced without membrane split inputs. It belongs to the superseded input set and is not counted as current pressure-consistent confirmation. The corrected claim is instead supported by direct packetwise DOP853 and the independently coded RK4 result in Section 4.9.</w:t>
       </w:r>
     </w:p>
     <w:p>
@@ -7875,7 +8147,7 @@
           <w:color w:val="000000"/>
           <w:sz w:val="21"/>
         </w:rPr>
-        <w:t>The work contributes a separation-process operating rule: pressure-consistent regeneration inventory, strict product quality, and uncertain feed and adsorption performance are optimized together. Public experiments validate transferable dynamic, mass-transfer, inhibition, recovery, and rejection behavior, while their measurement limits are carried into the claim boundary. The missing experiment is a synchronized test of the final integrated apparatus at the declared ppm limits.</w:t>
+        <w:t>The work contributes a separation-process operating rule: pressure-consistent regeneration inventory, strict product quality, and uncertain feed and adsorption performance are optimized together. The quantitative Wang reconstruction tests transferable dynamic adsorption and pressure-network equations. The post-freeze Chen and Voigt hold-outs add independent directional evidence for the purity-recovery trade-off, purge allocation, feed-dependent cycle settings, and the joint event without changing model parameters or thresholds. Public membrane experiments validate transferable mass-transfer, inhibition, recovery, and rejection behavior, while their measurement limits are carried into the claim boundary. The missing experiment is a synchronized test of the final integrated apparatus at the declared ppm limits.</w:t>
       </w:r>
     </w:p>
     <w:p>
@@ -7923,7 +8195,7 @@
           <w:color w:val="000000"/>
           <w:sz w:val="21"/>
         </w:rPr>
-        <w:t>The main limitations are the uniform engineering uncertainty measure, transfer of adsorption and membrane parameters across apparatuses, common constitutive laws in DOP853 and RK4, use of supplied horizon-averaged membrane split fractions in DWSIM, and the lack of a matched component-resolved integrated experiment. Device-specific execution is limited to a seven-qubit truth-table test at two-bit resolution; coherent QAE and the 42- and 66-logical-qubit arithmetic realizations were not run. The coarse two-bit uniform-grid fraction is therefore not used as the reported process probability. Public membrane studies establish feasibility, recovery scale, degradation stresses, and rejection cases, but their feeds, pressures, modules, and analytical resolutions differ. These boundaries define the next validation work and do not change the pressure-consistent numerical design decision reported here.</w:t>
+        <w:t>The main limitations are the uniform engineering uncertainty measure, transfer of adsorption and membrane parameters across apparatuses, common constitutive laws in DOP853 and RK4, use of supplied horizon-averaged membrane split fractions in DWSIM, and the lack of a matched component-resolved integrated experiment. The Chen and Voigt records are post-freeze external controls, but their different rigs allow directional and event-structure claims rather than pointwise prediction errors; the Voigt Type 1 class is limited by a 0.5 vol% CH4 analyzer threshold and cannot resolve the project ppm gate. Device-specific execution is limited to a seven-qubit truth-table test at two-bit resolution; coherent QAE and the 42- and 66-logical-qubit arithmetic realizations were not run. The coarse two-bit uniform-grid fraction is therefore not used as the reported process probability. Public membrane studies establish feasibility, recovery scale, degradation stresses, and rejection cases, but their feeds, pressures, modules, and analytical resolutions differ. These boundaries define the next validation work and do not change the pressure-consistent numerical design decision reported here.</w:t>
       </w:r>
     </w:p>
     <w:p>
@@ -7976,7 +8248,7 @@
           <w:color w:val="000000"/>
           <w:sz w:val="21"/>
         </w:rPr>
-        <w:t>The corrected DWSIM calculation solved all 16 horizon-averaged cases and quantified the adiabatic compression penalty above the isothermal screen. The physical chance event at 0.440 m2 has conservative continuous probability 0.951210 and 10-bit discrete probability 0.950629 with no direct label errors. The verified portable oracle requires 66 logical qubits and has an exact pre-routing count of 24,042 CX gates. An exact seven-qubit reduction of the same final event classified all 64 two-bit inputs correctly by majority vote on IBM Kingston, with mean expected-label probability 0.8389 and 7 QPU s usage. This establishes a reproducible process-to-device path while leaving coherent QAE and full arithmetic-oracle execution as future work. RQMC remains preferred for the present model; QAE becomes relevant when validated plant uncertainty and repeated probability queries make classical event evaluation expensive. A synchronized integrated separation experiment remains the principal external validation step.</w:t>
+        <w:t>Two post-freeze public experimental hold-outs strengthened the engineering interpretation without refitting: the Chen two-bed campaign passed all 12 directional endpoint tests, and the Voigt four-bed campaign produced 6/13 source-defined purity-recovery passes with at least one pass in every transient feed stage and a purge/feed-recovery Spearman association of -0.758. These experiments support the operating logic but do not resolve the final component-specific ppm gate. The corrected DWSIM calculation solved all 16 horizon-averaged cases and quantified the adiabatic compression penalty above the isothermal screen. The physical chance event at 0.440 m2 has conservative continuous probability 0.951210 and 10-bit discrete probability 0.950629 with no direct label errors. The verified portable oracle requires 66 logical qubits and has an exact pre-routing count of 24,042 CX gates. An exact seven-qubit reduction of the same final event classified all 64 two-bit inputs correctly by majority vote on IBM Kingston, with mean expected-label probability 0.8389 and 7 QPU s usage. This establishes a reproducible process-to-device path while leaving coherent QAE and full arithmetic-oracle execution as future work. RQMC remains preferred for the present model; QAE becomes relevant when validated plant uncertainty and repeated probability queries make classical event evaluation expensive. A synchronized integrated separation experiment remains the principal external validation step.</w:t>
       </w:r>
     </w:p>
     <w:p>
@@ -8528,6 +8800,36 @@
           <w:sz w:val="17"/>
         </w:rPr>
         <w:t>[30] G. Bang, D.K. Moon, J.H. Kang, Y.J. Han, K.M. Kim, C.H. Lee, High-purity hydrogen production via a water-gas-shift reaction in a palladium-copper catalytic membrane reactor integrated with pressure swing adsorption, Chem. Eng. J. 411 (2021) 128473. https://doi.org/10.1016/j.cej.2021.128473.</w:t>
+      </w:r>
+    </w:p>
+    <w:p>
+      <w:pPr>
+        <w:spacing w:after="40"/>
+        <w:ind w:left="360" w:hanging="360"/>
+        <w:jc w:val="both"/>
+      </w:pPr>
+      <w:r>
+        <w:rPr>
+          <w:rFonts w:ascii="Times New Roman" w:hAnsi="Times New Roman"/>
+          <w:color w:val="000000"/>
+          <w:sz w:val="17"/>
+        </w:rPr>
+        <w:t>[31] W.-H. Chen, W.-H. Chen, R.-Y. Chein, A.T. Hoang, K. Manatura, S.R. Naqvi, Optimization of hydrogen purification via vacuum pressure swing adsorption, Energy Convers. Manag. X 20 (2023) 100459. https://doi.org/10.1016/j.ecmx.2023.100459.</w:t>
+      </w:r>
+    </w:p>
+    <w:p>
+      <w:pPr>
+        <w:spacing w:after="40"/>
+        <w:ind w:left="360" w:hanging="360"/>
+        <w:jc w:val="both"/>
+      </w:pPr>
+      <w:r>
+        <w:rPr>
+          <w:rFonts w:ascii="Times New Roman" w:hAnsi="Times New Roman"/>
+          <w:color w:val="000000"/>
+          <w:sz w:val="17"/>
+        </w:rPr>
+        <w:t>[32] J. Voigt, Pressure Swing Adsorption for the Recovery of Hydrogen from Underground Storages, TU Wien, Vienna, 2022. https://doi.org/10.34726/hss.2022.103430.</w:t>
       </w:r>
     </w:p>
     <w:sectPr>

</xml_diff>